<commit_message>
actualización de propuesta para virtualización de cursos
</commit_message>
<xml_diff>
--- a/propuesta/prop_invest/virtualizacion/curso_machine_learning_virtualizar.docx
+++ b/propuesta/prop_invest/virtualizacion/curso_machine_learning_virtualizar.docx
@@ -22,44 +22,189 @@
         <w:rPr>
           <w:b/>
           <w:bCs/>
-          <w:lang w:val="es-CO"/>
-        </w:rPr>
-        <w:t>Curso de machine learning para virtualizar</w:t>
-      </w:r>
-    </w:p>
-    <w:p>
-      <w:pPr>
-        <w:rPr>
-          <w:b/>
-          <w:bCs/>
-          <w:lang w:val="es-CO"/>
-        </w:rPr>
-      </w:pPr>
-      <w:r>
-        <w:rPr>
-          <w:b/>
-          <w:bCs/>
-          <w:lang w:val="es-CO"/>
-        </w:rPr>
-        <w:t>Profesores encargados: Marco Julio Cañas Campillo</w:t>
-      </w:r>
-    </w:p>
-    <w:p>
-      <w:pPr>
-        <w:rPr>
-          <w:b/>
-          <w:bCs/>
-          <w:lang w:val="es-CO"/>
-        </w:rPr>
-      </w:pPr>
-      <w:r>
-        <w:rPr>
-          <w:b/>
-          <w:bCs/>
-          <w:lang w:val="es-CO"/>
-        </w:rPr>
-        <w:t>Luz Mariela Lopez Nohava</w:t>
-      </w:r>
+          <w:i/>
+          <w:iCs/>
+          <w:lang w:val="es-CO"/>
+        </w:rPr>
+        <w:t>Curso de</w:t>
+      </w:r>
+      <w:r>
+        <w:rPr>
+          <w:b/>
+          <w:bCs/>
+          <w:i/>
+          <w:iCs/>
+          <w:lang w:val="es-CO"/>
+        </w:rPr>
+        <w:t xml:space="preserve"> Introducción al M</w:t>
+      </w:r>
+      <w:r>
+        <w:rPr>
+          <w:b/>
+          <w:bCs/>
+          <w:i/>
+          <w:iCs/>
+          <w:lang w:val="es-CO"/>
+        </w:rPr>
+        <w:t xml:space="preserve">achine </w:t>
+      </w:r>
+      <w:proofErr w:type="spellStart"/>
+      <w:r>
+        <w:rPr>
+          <w:b/>
+          <w:bCs/>
+          <w:i/>
+          <w:iCs/>
+          <w:lang w:val="es-CO"/>
+        </w:rPr>
+        <w:t>L</w:t>
+      </w:r>
+      <w:r>
+        <w:rPr>
+          <w:b/>
+          <w:bCs/>
+          <w:i/>
+          <w:iCs/>
+          <w:lang w:val="es-CO"/>
+        </w:rPr>
+        <w:t>earning</w:t>
+      </w:r>
+      <w:proofErr w:type="spellEnd"/>
+      <w:r>
+        <w:rPr>
+          <w:b/>
+          <w:bCs/>
+          <w:i/>
+          <w:iCs/>
+          <w:lang w:val="es-CO"/>
+        </w:rPr>
+        <w:t xml:space="preserve"> </w:t>
+      </w:r>
+      <w:r>
+        <w:rPr>
+          <w:b/>
+          <w:bCs/>
+          <w:i/>
+          <w:iCs/>
+          <w:lang w:val="es-CO"/>
+        </w:rPr>
+        <w:t>y a la ciencia de datos con Python</w:t>
+      </w:r>
+      <w:r>
+        <w:rPr>
+          <w:b/>
+          <w:bCs/>
+          <w:i/>
+          <w:iCs/>
+          <w:lang w:val="es-CO"/>
+        </w:rPr>
+        <w:t>,</w:t>
+      </w:r>
+      <w:r>
+        <w:rPr>
+          <w:b/>
+          <w:bCs/>
+          <w:lang w:val="es-CO"/>
+        </w:rPr>
+        <w:t xml:space="preserve"> </w:t>
+      </w:r>
+      <w:r>
+        <w:rPr>
+          <w:b/>
+          <w:bCs/>
+          <w:lang w:val="es-CO"/>
+        </w:rPr>
+        <w:t>para virtualizar</w:t>
+      </w:r>
+    </w:p>
+    <w:p>
+      <w:pPr>
+        <w:rPr>
+          <w:b/>
+          <w:bCs/>
+          <w:lang w:val="es-CO"/>
+        </w:rPr>
+      </w:pPr>
+      <w:r>
+        <w:rPr>
+          <w:b/>
+          <w:bCs/>
+          <w:lang w:val="es-CO"/>
+        </w:rPr>
+        <w:t xml:space="preserve">Profesores encargados: </w:t>
+      </w:r>
+    </w:p>
+    <w:p>
+      <w:pPr>
+        <w:pStyle w:val="ListParagraph"/>
+        <w:numPr>
+          <w:ilvl w:val="0"/>
+          <w:numId w:val="4"/>
+        </w:numPr>
+        <w:rPr>
+          <w:b/>
+          <w:bCs/>
+          <w:lang w:val="es-CO"/>
+        </w:rPr>
+      </w:pPr>
+      <w:r>
+        <w:rPr>
+          <w:b/>
+          <w:bCs/>
+          <w:lang w:val="es-CO"/>
+        </w:rPr>
+        <w:t>Marco Julio Cañas Campillo</w:t>
+      </w:r>
+    </w:p>
+    <w:p>
+      <w:pPr>
+        <w:pStyle w:val="ListParagraph"/>
+        <w:numPr>
+          <w:ilvl w:val="0"/>
+          <w:numId w:val="4"/>
+        </w:numPr>
+        <w:rPr>
+          <w:b/>
+          <w:bCs/>
+          <w:lang w:val="es-CO"/>
+        </w:rPr>
+      </w:pPr>
+      <w:r>
+        <w:rPr>
+          <w:b/>
+          <w:bCs/>
+          <w:lang w:val="es-CO"/>
+        </w:rPr>
+        <w:t xml:space="preserve">Luz Mariela </w:t>
+      </w:r>
+      <w:proofErr w:type="spellStart"/>
+      <w:r>
+        <w:rPr>
+          <w:b/>
+          <w:bCs/>
+          <w:lang w:val="es-CO"/>
+        </w:rPr>
+        <w:t>Lopez</w:t>
+      </w:r>
+      <w:proofErr w:type="spellEnd"/>
+      <w:r>
+        <w:rPr>
+          <w:b/>
+          <w:bCs/>
+          <w:lang w:val="es-CO"/>
+        </w:rPr>
+        <w:t xml:space="preserve"> </w:t>
+      </w:r>
+      <w:proofErr w:type="spellStart"/>
+      <w:r>
+        <w:rPr>
+          <w:b/>
+          <w:bCs/>
+          <w:lang w:val="es-CO"/>
+        </w:rPr>
+        <w:t>Nohava</w:t>
+      </w:r>
+      <w:proofErr w:type="spellEnd"/>
     </w:p>
     <w:p>
       <w:pPr>
@@ -136,7 +281,86 @@
           <w:szCs w:val="24"/>
           <w:lang w:val="es-CO"/>
         </w:rPr>
-        <w:t xml:space="preserve"> machine Learning o ciencia de datos</w:t>
+        <w:t xml:space="preserve"> </w:t>
+      </w:r>
+      <w:r>
+        <w:rPr>
+          <w:rFonts w:ascii="Times New Roman" w:eastAsia="Times New Roman" w:hAnsi="Times New Roman" w:cs="Times New Roman"/>
+          <w:b/>
+          <w:bCs/>
+          <w:sz w:val="24"/>
+          <w:szCs w:val="24"/>
+          <w:lang w:val="es-CO"/>
+        </w:rPr>
+        <w:t>M</w:t>
+      </w:r>
+      <w:r>
+        <w:rPr>
+          <w:rFonts w:ascii="Times New Roman" w:eastAsia="Times New Roman" w:hAnsi="Times New Roman" w:cs="Times New Roman"/>
+          <w:b/>
+          <w:bCs/>
+          <w:sz w:val="24"/>
+          <w:szCs w:val="24"/>
+          <w:lang w:val="es-CO"/>
+        </w:rPr>
+        <w:t xml:space="preserve">achine </w:t>
+      </w:r>
+      <w:proofErr w:type="spellStart"/>
+      <w:r>
+        <w:rPr>
+          <w:rFonts w:ascii="Times New Roman" w:eastAsia="Times New Roman" w:hAnsi="Times New Roman" w:cs="Times New Roman"/>
+          <w:b/>
+          <w:bCs/>
+          <w:sz w:val="24"/>
+          <w:szCs w:val="24"/>
+          <w:lang w:val="es-CO"/>
+        </w:rPr>
+        <w:t>Learning</w:t>
+      </w:r>
+      <w:proofErr w:type="spellEnd"/>
+      <w:r>
+        <w:rPr>
+          <w:rFonts w:ascii="Times New Roman" w:eastAsia="Times New Roman" w:hAnsi="Times New Roman" w:cs="Times New Roman"/>
+          <w:b/>
+          <w:bCs/>
+          <w:sz w:val="24"/>
+          <w:szCs w:val="24"/>
+          <w:lang w:val="es-CO"/>
+        </w:rPr>
+        <w:t xml:space="preserve"> </w:t>
+      </w:r>
+      <w:r>
+        <w:rPr>
+          <w:rFonts w:ascii="Times New Roman" w:eastAsia="Times New Roman" w:hAnsi="Times New Roman" w:cs="Times New Roman"/>
+          <w:b/>
+          <w:bCs/>
+          <w:sz w:val="24"/>
+          <w:szCs w:val="24"/>
+          <w:lang w:val="es-CO"/>
+        </w:rPr>
+        <w:t>y a la</w:t>
+      </w:r>
+      <w:r>
+        <w:rPr>
+          <w:rFonts w:ascii="Times New Roman" w:eastAsia="Times New Roman" w:hAnsi="Times New Roman" w:cs="Times New Roman"/>
+          <w:b/>
+          <w:bCs/>
+          <w:sz w:val="24"/>
+          <w:szCs w:val="24"/>
+          <w:lang w:val="es-CO"/>
+        </w:rPr>
+        <w:t xml:space="preserve"> ciencia de datos</w:t>
+      </w:r>
+      <w:r>
+        <w:rPr>
+          <w:rFonts w:ascii="Times New Roman" w:eastAsia="Times New Roman" w:hAnsi="Times New Roman" w:cs="Times New Roman"/>
+          <w:b/>
+          <w:bCs/>
+          <w:sz w:val="24"/>
+          <w:szCs w:val="24"/>
+          <w:lang w:val="es-CO"/>
+        </w:rPr>
+        <w:t xml:space="preserve"> con Python</w:t>
       </w:r>
     </w:p>
     <w:p>
@@ -245,18 +469,18 @@
           <w:szCs w:val="24"/>
           <w:lang w:val="es-CO"/>
         </w:rPr>
-        <w:t>3</w:t>
-      </w:r>
-      <w:r>
-        <w:rPr>
-          <w:rFonts w:ascii="Times New Roman" w:eastAsia="Times New Roman" w:hAnsi="Times New Roman" w:cs="Times New Roman"/>
-          <w:b/>
-          <w:bCs/>
-          <w:sz w:val="24"/>
-          <w:szCs w:val="24"/>
-          <w:lang w:val="es-CO"/>
-        </w:rPr>
-        <w:t>6 horas</w:t>
+        <w:t>16</w:t>
+      </w:r>
+      <w:r>
+        <w:rPr>
+          <w:rFonts w:ascii="Times New Roman" w:eastAsia="Times New Roman" w:hAnsi="Times New Roman" w:cs="Times New Roman"/>
+          <w:b/>
+          <w:bCs/>
+          <w:sz w:val="24"/>
+          <w:szCs w:val="24"/>
+          <w:lang w:val="es-CO"/>
+        </w:rPr>
+        <w:t xml:space="preserve"> horas</w:t>
       </w:r>
     </w:p>
     <w:p>
@@ -348,7 +572,27 @@
           <w:szCs w:val="24"/>
           <w:lang w:val="es-CO"/>
         </w:rPr>
-        <w:t xml:space="preserve">En cuanto a la pertinencia académica de virtualizar este curso de machine learning </w:t>
+        <w:t xml:space="preserve">En cuanto a la pertinencia académica de virtualizar este curso de machine </w:t>
+      </w:r>
+      <w:proofErr w:type="spellStart"/>
+      <w:r>
+        <w:rPr>
+          <w:rFonts w:ascii="Times New Roman" w:eastAsia="Times New Roman" w:hAnsi="Times New Roman" w:cs="Times New Roman"/>
+          <w:sz w:val="24"/>
+          <w:szCs w:val="24"/>
+          <w:lang w:val="es-CO"/>
+        </w:rPr>
+        <w:t>learning</w:t>
+      </w:r>
+      <w:proofErr w:type="spellEnd"/>
+      <w:r>
+        <w:rPr>
+          <w:rFonts w:ascii="Times New Roman" w:eastAsia="Times New Roman" w:hAnsi="Times New Roman" w:cs="Times New Roman"/>
+          <w:sz w:val="24"/>
+          <w:szCs w:val="24"/>
+          <w:lang w:val="es-CO"/>
+        </w:rPr>
+        <w:t xml:space="preserve"> </w:t>
       </w:r>
       <w:r>
         <w:rPr>
@@ -421,7 +665,47 @@
           <w:szCs w:val="24"/>
           <w:lang w:val="es-CO"/>
         </w:rPr>
-        <w:t xml:space="preserve">as metodologías en análisis de datos se pueden aprender a través de videos cortos que ejemplifiquen la manera de procesar la información con Python y de constituir modelos predictivos de machine learning con skilearn. </w:t>
+        <w:t xml:space="preserve">as metodologías en análisis de datos se pueden aprender a través de videos cortos que ejemplifiquen la manera de procesar la información con Python y de constituir modelos predictivos de machine </w:t>
+      </w:r>
+      <w:proofErr w:type="spellStart"/>
+      <w:r>
+        <w:rPr>
+          <w:rFonts w:ascii="Times New Roman" w:eastAsia="Times New Roman" w:hAnsi="Times New Roman" w:cs="Times New Roman"/>
+          <w:sz w:val="24"/>
+          <w:szCs w:val="24"/>
+          <w:lang w:val="es-CO"/>
+        </w:rPr>
+        <w:t>learning</w:t>
+      </w:r>
+      <w:proofErr w:type="spellEnd"/>
+      <w:r>
+        <w:rPr>
+          <w:rFonts w:ascii="Times New Roman" w:eastAsia="Times New Roman" w:hAnsi="Times New Roman" w:cs="Times New Roman"/>
+          <w:sz w:val="24"/>
+          <w:szCs w:val="24"/>
+          <w:lang w:val="es-CO"/>
+        </w:rPr>
+        <w:t xml:space="preserve"> con </w:t>
+      </w:r>
+      <w:proofErr w:type="spellStart"/>
+      <w:r>
+        <w:rPr>
+          <w:rFonts w:ascii="Times New Roman" w:eastAsia="Times New Roman" w:hAnsi="Times New Roman" w:cs="Times New Roman"/>
+          <w:sz w:val="24"/>
+          <w:szCs w:val="24"/>
+          <w:lang w:val="es-CO"/>
+        </w:rPr>
+        <w:t>skilearn</w:t>
+      </w:r>
+      <w:proofErr w:type="spellEnd"/>
+      <w:r>
+        <w:rPr>
+          <w:rFonts w:ascii="Times New Roman" w:eastAsia="Times New Roman" w:hAnsi="Times New Roman" w:cs="Times New Roman"/>
+          <w:sz w:val="24"/>
+          <w:szCs w:val="24"/>
+          <w:lang w:val="es-CO"/>
+        </w:rPr>
+        <w:t xml:space="preserve">. </w:t>
       </w:r>
       <w:r>
         <w:rPr>
@@ -439,7 +723,27 @@
           <w:szCs w:val="24"/>
           <w:lang w:val="es-CO"/>
         </w:rPr>
-        <w:t xml:space="preserve">a través de cuaderno jupyter para lectura interactiva y experimental. </w:t>
+        <w:t xml:space="preserve">a través de cuaderno </w:t>
+      </w:r>
+      <w:proofErr w:type="spellStart"/>
+      <w:r>
+        <w:rPr>
+          <w:rFonts w:ascii="Times New Roman" w:eastAsia="Times New Roman" w:hAnsi="Times New Roman" w:cs="Times New Roman"/>
+          <w:sz w:val="24"/>
+          <w:szCs w:val="24"/>
+          <w:lang w:val="es-CO"/>
+        </w:rPr>
+        <w:t>jupyter</w:t>
+      </w:r>
+      <w:proofErr w:type="spellEnd"/>
+      <w:r>
+        <w:rPr>
+          <w:rFonts w:ascii="Times New Roman" w:eastAsia="Times New Roman" w:hAnsi="Times New Roman" w:cs="Times New Roman"/>
+          <w:sz w:val="24"/>
+          <w:szCs w:val="24"/>
+          <w:lang w:val="es-CO"/>
+        </w:rPr>
+        <w:t xml:space="preserve"> para lectura interactiva y experimental. </w:t>
       </w:r>
     </w:p>
     <w:p>
@@ -459,7 +763,27 @@
           <w:szCs w:val="24"/>
           <w:lang w:val="es-CO"/>
         </w:rPr>
-        <w:t xml:space="preserve">Virtualizar el curso de machine learning permite a las personas acceder </w:t>
+        <w:t xml:space="preserve">Virtualizar el curso de machine </w:t>
+      </w:r>
+      <w:proofErr w:type="spellStart"/>
+      <w:r>
+        <w:rPr>
+          <w:rFonts w:ascii="Times New Roman" w:eastAsia="Times New Roman" w:hAnsi="Times New Roman" w:cs="Times New Roman"/>
+          <w:sz w:val="24"/>
+          <w:szCs w:val="24"/>
+          <w:lang w:val="es-CO"/>
+        </w:rPr>
+        <w:t>learning</w:t>
+      </w:r>
+      <w:proofErr w:type="spellEnd"/>
+      <w:r>
+        <w:rPr>
+          <w:rFonts w:ascii="Times New Roman" w:eastAsia="Times New Roman" w:hAnsi="Times New Roman" w:cs="Times New Roman"/>
+          <w:sz w:val="24"/>
+          <w:szCs w:val="24"/>
+          <w:lang w:val="es-CO"/>
+        </w:rPr>
+        <w:t xml:space="preserve"> permite a las personas acceder </w:t>
       </w:r>
       <w:r>
         <w:rPr>
@@ -499,6 +823,7 @@
           <w:szCs w:val="24"/>
           <w:lang w:val="es-CO"/>
         </w:rPr>
+        <w:lastRenderedPageBreak/>
         <w:t xml:space="preserve">Y en la actualidad, </w:t>
       </w:r>
       <w:r>
@@ -526,7 +851,27 @@
           <w:szCs w:val="24"/>
           <w:lang w:val="es-CO"/>
         </w:rPr>
-        <w:t xml:space="preserve">icas de machine learning a través del lenguaje gratuito que es Python, </w:t>
+        <w:t xml:space="preserve">icas de machine </w:t>
+      </w:r>
+      <w:proofErr w:type="spellStart"/>
+      <w:r>
+        <w:rPr>
+          <w:rFonts w:ascii="Times New Roman" w:eastAsia="Times New Roman" w:hAnsi="Times New Roman" w:cs="Times New Roman"/>
+          <w:sz w:val="24"/>
+          <w:szCs w:val="24"/>
+          <w:lang w:val="es-CO"/>
+        </w:rPr>
+        <w:t>learning</w:t>
+      </w:r>
+      <w:proofErr w:type="spellEnd"/>
+      <w:r>
+        <w:rPr>
+          <w:rFonts w:ascii="Times New Roman" w:eastAsia="Times New Roman" w:hAnsi="Times New Roman" w:cs="Times New Roman"/>
+          <w:sz w:val="24"/>
+          <w:szCs w:val="24"/>
+          <w:lang w:val="es-CO"/>
+        </w:rPr>
+        <w:t xml:space="preserve"> a través del lenguaje gratuito que es Python, </w:t>
       </w:r>
       <w:r>
         <w:rPr>
@@ -661,7 +1006,27 @@
           <w:szCs w:val="24"/>
           <w:lang w:val="es-CO"/>
         </w:rPr>
-        <w:t xml:space="preserve"> de Machine learning aplicadas con lenguaje de programación Python</w:t>
+        <w:t xml:space="preserve"> de Machine </w:t>
+      </w:r>
+      <w:proofErr w:type="spellStart"/>
+      <w:r>
+        <w:rPr>
+          <w:rFonts w:ascii="Times New Roman" w:eastAsia="Times New Roman" w:hAnsi="Times New Roman" w:cs="Times New Roman"/>
+          <w:sz w:val="24"/>
+          <w:szCs w:val="24"/>
+          <w:lang w:val="es-CO"/>
+        </w:rPr>
+        <w:t>learning</w:t>
+      </w:r>
+      <w:proofErr w:type="spellEnd"/>
+      <w:r>
+        <w:rPr>
+          <w:rFonts w:ascii="Times New Roman" w:eastAsia="Times New Roman" w:hAnsi="Times New Roman" w:cs="Times New Roman"/>
+          <w:sz w:val="24"/>
+          <w:szCs w:val="24"/>
+          <w:lang w:val="es-CO"/>
+        </w:rPr>
+        <w:t xml:space="preserve"> aplicadas con lenguaje de programación Python</w:t>
       </w:r>
       <w:r>
         <w:rPr>
@@ -696,8 +1061,20 @@
           <w:sz w:val="24"/>
           <w:szCs w:val="24"/>
         </w:rPr>
-        <w:t>Público objetivo</w:t>
-      </w:r>
+        <w:t xml:space="preserve">Público </w:t>
+      </w:r>
+      <w:proofErr w:type="spellStart"/>
+      <w:r>
+        <w:rPr>
+          <w:rFonts w:ascii="Times New Roman" w:eastAsia="Times New Roman" w:hAnsi="Times New Roman" w:cs="Times New Roman"/>
+          <w:b/>
+          <w:bCs/>
+          <w:sz w:val="24"/>
+          <w:szCs w:val="24"/>
+        </w:rPr>
+        <w:t>objetivo</w:t>
+      </w:r>
+      <w:proofErr w:type="spellEnd"/>
     </w:p>
     <w:p>
       <w:pPr>
@@ -761,7 +1138,27 @@
           <w:szCs w:val="24"/>
           <w:lang w:val="es-CO"/>
         </w:rPr>
-        <w:t xml:space="preserve">aprender técnicas de machine learning </w:t>
+        <w:t xml:space="preserve">aprender técnicas de machine </w:t>
+      </w:r>
+      <w:proofErr w:type="spellStart"/>
+      <w:r>
+        <w:rPr>
+          <w:rFonts w:ascii="Times New Roman" w:eastAsia="Times New Roman" w:hAnsi="Times New Roman" w:cs="Times New Roman"/>
+          <w:sz w:val="24"/>
+          <w:szCs w:val="24"/>
+          <w:lang w:val="es-CO"/>
+        </w:rPr>
+        <w:t>learning</w:t>
+      </w:r>
+      <w:proofErr w:type="spellEnd"/>
+      <w:r>
+        <w:rPr>
+          <w:rFonts w:ascii="Times New Roman" w:eastAsia="Times New Roman" w:hAnsi="Times New Roman" w:cs="Times New Roman"/>
+          <w:sz w:val="24"/>
+          <w:szCs w:val="24"/>
+          <w:lang w:val="es-CO"/>
+        </w:rPr>
+        <w:t xml:space="preserve"> </w:t>
       </w:r>
       <w:r>
         <w:rPr>
@@ -950,16 +1347,87 @@
           <w:szCs w:val="24"/>
           <w:lang w:val="es-CO"/>
         </w:rPr>
-        <w:t>Estadística descriptiva para ciencia de datos</w:t>
-      </w:r>
-      <w:r>
-        <w:rPr>
-          <w:rFonts w:ascii="Times New Roman" w:eastAsia="Times New Roman" w:hAnsi="Times New Roman" w:cs="Times New Roman"/>
-          <w:sz w:val="24"/>
-          <w:szCs w:val="24"/>
-          <w:lang w:val="es-CO"/>
-        </w:rPr>
-        <w:t>(Numpy, Scipy, statistics)</w:t>
+        <w:t xml:space="preserve">Estadística descriptiva para ciencia de </w:t>
+      </w:r>
+      <w:proofErr w:type="gramStart"/>
+      <w:r>
+        <w:rPr>
+          <w:rFonts w:ascii="Times New Roman" w:eastAsia="Times New Roman" w:hAnsi="Times New Roman" w:cs="Times New Roman"/>
+          <w:sz w:val="24"/>
+          <w:szCs w:val="24"/>
+          <w:lang w:val="es-CO"/>
+        </w:rPr>
+        <w:t>datos</w:t>
+      </w:r>
+      <w:r>
+        <w:rPr>
+          <w:rFonts w:ascii="Times New Roman" w:eastAsia="Times New Roman" w:hAnsi="Times New Roman" w:cs="Times New Roman"/>
+          <w:sz w:val="24"/>
+          <w:szCs w:val="24"/>
+          <w:lang w:val="es-CO"/>
+        </w:rPr>
+        <w:t>(</w:t>
+      </w:r>
+      <w:proofErr w:type="spellStart"/>
+      <w:proofErr w:type="gramEnd"/>
+      <w:r>
+        <w:rPr>
+          <w:rFonts w:ascii="Times New Roman" w:eastAsia="Times New Roman" w:hAnsi="Times New Roman" w:cs="Times New Roman"/>
+          <w:sz w:val="24"/>
+          <w:szCs w:val="24"/>
+          <w:lang w:val="es-CO"/>
+        </w:rPr>
+        <w:t>Numpy</w:t>
+      </w:r>
+      <w:proofErr w:type="spellEnd"/>
+      <w:r>
+        <w:rPr>
+          <w:rFonts w:ascii="Times New Roman" w:eastAsia="Times New Roman" w:hAnsi="Times New Roman" w:cs="Times New Roman"/>
+          <w:sz w:val="24"/>
+          <w:szCs w:val="24"/>
+          <w:lang w:val="es-CO"/>
+        </w:rPr>
+        <w:t xml:space="preserve">, </w:t>
+      </w:r>
+      <w:proofErr w:type="spellStart"/>
+      <w:r>
+        <w:rPr>
+          <w:rFonts w:ascii="Times New Roman" w:eastAsia="Times New Roman" w:hAnsi="Times New Roman" w:cs="Times New Roman"/>
+          <w:sz w:val="24"/>
+          <w:szCs w:val="24"/>
+          <w:lang w:val="es-CO"/>
+        </w:rPr>
+        <w:t>Scipy</w:t>
+      </w:r>
+      <w:proofErr w:type="spellEnd"/>
+      <w:r>
+        <w:rPr>
+          <w:rFonts w:ascii="Times New Roman" w:eastAsia="Times New Roman" w:hAnsi="Times New Roman" w:cs="Times New Roman"/>
+          <w:sz w:val="24"/>
+          <w:szCs w:val="24"/>
+          <w:lang w:val="es-CO"/>
+        </w:rPr>
+        <w:t xml:space="preserve">, </w:t>
+      </w:r>
+      <w:proofErr w:type="spellStart"/>
+      <w:r>
+        <w:rPr>
+          <w:rFonts w:ascii="Times New Roman" w:eastAsia="Times New Roman" w:hAnsi="Times New Roman" w:cs="Times New Roman"/>
+          <w:sz w:val="24"/>
+          <w:szCs w:val="24"/>
+          <w:lang w:val="es-CO"/>
+        </w:rPr>
+        <w:t>statistics</w:t>
+      </w:r>
+      <w:proofErr w:type="spellEnd"/>
+      <w:r>
+        <w:rPr>
+          <w:rFonts w:ascii="Times New Roman" w:eastAsia="Times New Roman" w:hAnsi="Times New Roman" w:cs="Times New Roman"/>
+          <w:sz w:val="24"/>
+          <w:szCs w:val="24"/>
+          <w:lang w:val="es-CO"/>
+        </w:rPr>
+        <w:t>)</w:t>
       </w:r>
     </w:p>
     <w:p>
@@ -1009,7 +1477,67 @@
           <w:szCs w:val="24"/>
           <w:lang w:val="es-CO"/>
         </w:rPr>
-        <w:t xml:space="preserve">Visualización de datos con matplotlib, seaborn y plotly de Python. </w:t>
+        <w:t xml:space="preserve">Visualización de datos con </w:t>
+      </w:r>
+      <w:proofErr w:type="spellStart"/>
+      <w:r>
+        <w:rPr>
+          <w:rFonts w:ascii="Times New Roman" w:eastAsia="Times New Roman" w:hAnsi="Times New Roman" w:cs="Times New Roman"/>
+          <w:sz w:val="24"/>
+          <w:szCs w:val="24"/>
+          <w:lang w:val="es-CO"/>
+        </w:rPr>
+        <w:t>matplotlib</w:t>
+      </w:r>
+      <w:proofErr w:type="spellEnd"/>
+      <w:r>
+        <w:rPr>
+          <w:rFonts w:ascii="Times New Roman" w:eastAsia="Times New Roman" w:hAnsi="Times New Roman" w:cs="Times New Roman"/>
+          <w:sz w:val="24"/>
+          <w:szCs w:val="24"/>
+          <w:lang w:val="es-CO"/>
+        </w:rPr>
+        <w:t xml:space="preserve">, </w:t>
+      </w:r>
+      <w:proofErr w:type="spellStart"/>
+      <w:r>
+        <w:rPr>
+          <w:rFonts w:ascii="Times New Roman" w:eastAsia="Times New Roman" w:hAnsi="Times New Roman" w:cs="Times New Roman"/>
+          <w:sz w:val="24"/>
+          <w:szCs w:val="24"/>
+          <w:lang w:val="es-CO"/>
+        </w:rPr>
+        <w:t>seaborn</w:t>
+      </w:r>
+      <w:proofErr w:type="spellEnd"/>
+      <w:r>
+        <w:rPr>
+          <w:rFonts w:ascii="Times New Roman" w:eastAsia="Times New Roman" w:hAnsi="Times New Roman" w:cs="Times New Roman"/>
+          <w:sz w:val="24"/>
+          <w:szCs w:val="24"/>
+          <w:lang w:val="es-CO"/>
+        </w:rPr>
+        <w:t xml:space="preserve"> y </w:t>
+      </w:r>
+      <w:proofErr w:type="spellStart"/>
+      <w:r>
+        <w:rPr>
+          <w:rFonts w:ascii="Times New Roman" w:eastAsia="Times New Roman" w:hAnsi="Times New Roman" w:cs="Times New Roman"/>
+          <w:sz w:val="24"/>
+          <w:szCs w:val="24"/>
+          <w:lang w:val="es-CO"/>
+        </w:rPr>
+        <w:t>plotly</w:t>
+      </w:r>
+      <w:proofErr w:type="spellEnd"/>
+      <w:r>
+        <w:rPr>
+          <w:rFonts w:ascii="Times New Roman" w:eastAsia="Times New Roman" w:hAnsi="Times New Roman" w:cs="Times New Roman"/>
+          <w:sz w:val="24"/>
+          <w:szCs w:val="24"/>
+          <w:lang w:val="es-CO"/>
+        </w:rPr>
+        <w:t xml:space="preserve"> de Python. </w:t>
       </w:r>
     </w:p>
     <w:p>
@@ -1034,7 +1562,27 @@
           <w:szCs w:val="24"/>
           <w:lang w:val="es-CO"/>
         </w:rPr>
-        <w:t xml:space="preserve">Preprocesamiento de datos con Sklearn </w:t>
+        <w:t xml:space="preserve">Preprocesamiento de datos con </w:t>
+      </w:r>
+      <w:proofErr w:type="spellStart"/>
+      <w:r>
+        <w:rPr>
+          <w:rFonts w:ascii="Times New Roman" w:eastAsia="Times New Roman" w:hAnsi="Times New Roman" w:cs="Times New Roman"/>
+          <w:sz w:val="24"/>
+          <w:szCs w:val="24"/>
+          <w:lang w:val="es-CO"/>
+        </w:rPr>
+        <w:t>Sklearn</w:t>
+      </w:r>
+      <w:proofErr w:type="spellEnd"/>
+      <w:r>
+        <w:rPr>
+          <w:rFonts w:ascii="Times New Roman" w:eastAsia="Times New Roman" w:hAnsi="Times New Roman" w:cs="Times New Roman"/>
+          <w:sz w:val="24"/>
+          <w:szCs w:val="24"/>
+          <w:lang w:val="es-CO"/>
+        </w:rPr>
+        <w:t xml:space="preserve"> </w:t>
       </w:r>
     </w:p>
     <w:p>
@@ -1059,7 +1607,47 @@
           <w:szCs w:val="24"/>
           <w:lang w:val="es-CO"/>
         </w:rPr>
-        <w:t>Constitución de modelos de clasificación binaria, multiclase, multisalida y multietiqueta.</w:t>
+        <w:t xml:space="preserve">Constitución de modelos de clasificación binaria, multiclase, </w:t>
+      </w:r>
+      <w:proofErr w:type="spellStart"/>
+      <w:r>
+        <w:rPr>
+          <w:rFonts w:ascii="Times New Roman" w:eastAsia="Times New Roman" w:hAnsi="Times New Roman" w:cs="Times New Roman"/>
+          <w:sz w:val="24"/>
+          <w:szCs w:val="24"/>
+          <w:lang w:val="es-CO"/>
+        </w:rPr>
+        <w:t>multisalida</w:t>
+      </w:r>
+      <w:proofErr w:type="spellEnd"/>
+      <w:r>
+        <w:rPr>
+          <w:rFonts w:ascii="Times New Roman" w:eastAsia="Times New Roman" w:hAnsi="Times New Roman" w:cs="Times New Roman"/>
+          <w:sz w:val="24"/>
+          <w:szCs w:val="24"/>
+          <w:lang w:val="es-CO"/>
+        </w:rPr>
+        <w:t xml:space="preserve"> y </w:t>
+      </w:r>
+      <w:proofErr w:type="spellStart"/>
+      <w:r>
+        <w:rPr>
+          <w:rFonts w:ascii="Times New Roman" w:eastAsia="Times New Roman" w:hAnsi="Times New Roman" w:cs="Times New Roman"/>
+          <w:sz w:val="24"/>
+          <w:szCs w:val="24"/>
+          <w:lang w:val="es-CO"/>
+        </w:rPr>
+        <w:t>multietiqueta</w:t>
+      </w:r>
+      <w:proofErr w:type="spellEnd"/>
+      <w:r>
+        <w:rPr>
+          <w:rFonts w:ascii="Times New Roman" w:eastAsia="Times New Roman" w:hAnsi="Times New Roman" w:cs="Times New Roman"/>
+          <w:sz w:val="24"/>
+          <w:szCs w:val="24"/>
+          <w:lang w:val="es-CO"/>
+        </w:rPr>
+        <w:t>.</w:t>
       </w:r>
     </w:p>
     <w:p>
@@ -1156,6 +1744,7 @@
           <w:szCs w:val="24"/>
         </w:rPr>
       </w:pPr>
+      <w:proofErr w:type="spellStart"/>
       <w:r>
         <w:rPr>
           <w:rFonts w:ascii="Times New Roman" w:eastAsia="Times New Roman" w:hAnsi="Times New Roman" w:cs="Times New Roman"/>
@@ -1166,6 +1755,7 @@
         </w:rPr>
         <w:t>Metodología</w:t>
       </w:r>
+      <w:proofErr w:type="spellEnd"/>
     </w:p>
     <w:p>
       <w:pPr>
@@ -1229,25 +1819,202 @@
           <w:szCs w:val="24"/>
           <w:lang w:val="es-CO"/>
         </w:rPr>
-        <w:t xml:space="preserve"> y videos de apoyo en YouTube articulados a cuadernos Jupyter </w:t>
-      </w:r>
-      <w:r>
-        <w:rPr>
-          <w:rFonts w:ascii="Times New Roman" w:eastAsia="Times New Roman" w:hAnsi="Times New Roman" w:cs="Times New Roman"/>
-          <w:sz w:val="24"/>
-          <w:szCs w:val="24"/>
-          <w:lang w:val="es-CO"/>
-        </w:rPr>
-        <w:t xml:space="preserve">interconectados para llevar al estudiante de manera secuencial a consolidar la comprensión y adquisición de </w:t>
-      </w:r>
-      <w:r>
-        <w:rPr>
-          <w:rFonts w:ascii="Times New Roman" w:eastAsia="Times New Roman" w:hAnsi="Times New Roman" w:cs="Times New Roman"/>
-          <w:sz w:val="24"/>
-          <w:szCs w:val="24"/>
-          <w:lang w:val="es-CO"/>
-        </w:rPr>
-        <w:t xml:space="preserve">habilidades de constitución de modelos predictivos de machine learning. </w:t>
+        <w:t xml:space="preserve"> y videos de apoyo en YouTube articulados a cuadernos </w:t>
+      </w:r>
+      <w:proofErr w:type="spellStart"/>
+      <w:r>
+        <w:rPr>
+          <w:rFonts w:ascii="Times New Roman" w:eastAsia="Times New Roman" w:hAnsi="Times New Roman" w:cs="Times New Roman"/>
+          <w:sz w:val="24"/>
+          <w:szCs w:val="24"/>
+          <w:lang w:val="es-CO"/>
+        </w:rPr>
+        <w:t>Jupyter</w:t>
+      </w:r>
+      <w:proofErr w:type="spellEnd"/>
+      <w:r>
+        <w:rPr>
+          <w:rFonts w:ascii="Times New Roman" w:eastAsia="Times New Roman" w:hAnsi="Times New Roman" w:cs="Times New Roman"/>
+          <w:sz w:val="24"/>
+          <w:szCs w:val="24"/>
+          <w:lang w:val="es-CO"/>
+        </w:rPr>
+        <w:t xml:space="preserve"> con vinculo Open in </w:t>
+      </w:r>
+      <w:proofErr w:type="spellStart"/>
+      <w:r>
+        <w:rPr>
+          <w:rFonts w:ascii="Times New Roman" w:eastAsia="Times New Roman" w:hAnsi="Times New Roman" w:cs="Times New Roman"/>
+          <w:sz w:val="24"/>
+          <w:szCs w:val="24"/>
+          <w:lang w:val="es-CO"/>
+        </w:rPr>
+        <w:t>Colab</w:t>
+      </w:r>
+      <w:proofErr w:type="spellEnd"/>
+      <w:r>
+        <w:rPr>
+          <w:rFonts w:ascii="Times New Roman" w:eastAsia="Times New Roman" w:hAnsi="Times New Roman" w:cs="Times New Roman"/>
+          <w:sz w:val="24"/>
+          <w:szCs w:val="24"/>
+          <w:lang w:val="es-CO"/>
+        </w:rPr>
+        <w:t xml:space="preserve"> que permite sacar copias de ellos </w:t>
+      </w:r>
+      <w:proofErr w:type="spellStart"/>
+      <w:r>
+        <w:rPr>
+          <w:rFonts w:ascii="Times New Roman" w:eastAsia="Times New Roman" w:hAnsi="Times New Roman" w:cs="Times New Roman"/>
+          <w:sz w:val="24"/>
+          <w:szCs w:val="24"/>
+          <w:lang w:val="es-CO"/>
+        </w:rPr>
+        <w:t>y</w:t>
+      </w:r>
+      <w:proofErr w:type="spellEnd"/>
+      <w:r>
+        <w:rPr>
+          <w:rFonts w:ascii="Times New Roman" w:eastAsia="Times New Roman" w:hAnsi="Times New Roman" w:cs="Times New Roman"/>
+          <w:sz w:val="24"/>
+          <w:szCs w:val="24"/>
+          <w:lang w:val="es-CO"/>
+        </w:rPr>
+        <w:t xml:space="preserve"> leerlos de manera interactiva </w:t>
+      </w:r>
+      <w:proofErr w:type="spellStart"/>
+      <w:r>
+        <w:rPr>
+          <w:rFonts w:ascii="Times New Roman" w:eastAsia="Times New Roman" w:hAnsi="Times New Roman" w:cs="Times New Roman"/>
+          <w:sz w:val="24"/>
+          <w:szCs w:val="24"/>
+          <w:lang w:val="es-CO"/>
+        </w:rPr>
+        <w:t>y</w:t>
+      </w:r>
+      <w:proofErr w:type="spellEnd"/>
+      <w:r>
+        <w:rPr>
+          <w:rFonts w:ascii="Times New Roman" w:eastAsia="Times New Roman" w:hAnsi="Times New Roman" w:cs="Times New Roman"/>
+          <w:sz w:val="24"/>
+          <w:szCs w:val="24"/>
+          <w:lang w:val="es-CO"/>
+        </w:rPr>
+        <w:t xml:space="preserve"> experimental a través de </w:t>
+      </w:r>
+      <w:r>
+        <w:rPr>
+          <w:rFonts w:ascii="Times New Roman" w:eastAsia="Times New Roman" w:hAnsi="Times New Roman" w:cs="Times New Roman"/>
+          <w:sz w:val="24"/>
+          <w:szCs w:val="24"/>
+          <w:lang w:val="es-CO"/>
+        </w:rPr>
+        <w:lastRenderedPageBreak/>
+        <w:t xml:space="preserve">la aplicación en Línea Google </w:t>
+      </w:r>
+      <w:proofErr w:type="spellStart"/>
+      <w:r>
+        <w:rPr>
+          <w:rFonts w:ascii="Times New Roman" w:eastAsia="Times New Roman" w:hAnsi="Times New Roman" w:cs="Times New Roman"/>
+          <w:sz w:val="24"/>
+          <w:szCs w:val="24"/>
+          <w:lang w:val="es-CO"/>
+        </w:rPr>
+        <w:t>Colab</w:t>
+      </w:r>
+      <w:proofErr w:type="spellEnd"/>
+      <w:r>
+        <w:rPr>
+          <w:rFonts w:ascii="Times New Roman" w:eastAsia="Times New Roman" w:hAnsi="Times New Roman" w:cs="Times New Roman"/>
+          <w:sz w:val="24"/>
+          <w:szCs w:val="24"/>
+          <w:lang w:val="es-CO"/>
+        </w:rPr>
+        <w:t xml:space="preserve"> (</w:t>
+      </w:r>
+      <w:proofErr w:type="spellStart"/>
+      <w:r>
+        <w:rPr>
+          <w:rFonts w:ascii="Times New Roman" w:eastAsia="Times New Roman" w:hAnsi="Times New Roman" w:cs="Times New Roman"/>
+          <w:sz w:val="24"/>
+          <w:szCs w:val="24"/>
+          <w:lang w:val="es-CO"/>
+        </w:rPr>
+        <w:t>Colaboratory</w:t>
+      </w:r>
+      <w:proofErr w:type="spellEnd"/>
+      <w:r>
+        <w:rPr>
+          <w:rFonts w:ascii="Times New Roman" w:eastAsia="Times New Roman" w:hAnsi="Times New Roman" w:cs="Times New Roman"/>
+          <w:sz w:val="24"/>
+          <w:szCs w:val="24"/>
+          <w:lang w:val="es-CO"/>
+        </w:rPr>
+        <w:t>); e</w:t>
+      </w:r>
+      <w:r>
+        <w:rPr>
+          <w:rFonts w:ascii="Times New Roman" w:eastAsia="Times New Roman" w:hAnsi="Times New Roman" w:cs="Times New Roman"/>
+          <w:sz w:val="24"/>
+          <w:szCs w:val="24"/>
+          <w:lang w:val="es-CO"/>
+        </w:rPr>
+        <w:t xml:space="preserve"> </w:t>
+      </w:r>
+      <w:r>
+        <w:rPr>
+          <w:rFonts w:ascii="Times New Roman" w:eastAsia="Times New Roman" w:hAnsi="Times New Roman" w:cs="Times New Roman"/>
+          <w:sz w:val="24"/>
+          <w:szCs w:val="24"/>
+          <w:lang w:val="es-CO"/>
+        </w:rPr>
+        <w:t xml:space="preserve">interconectados </w:t>
+      </w:r>
+      <w:r>
+        <w:rPr>
+          <w:rFonts w:ascii="Times New Roman" w:eastAsia="Times New Roman" w:hAnsi="Times New Roman" w:cs="Times New Roman"/>
+          <w:sz w:val="24"/>
+          <w:szCs w:val="24"/>
+          <w:lang w:val="es-CO"/>
+        </w:rPr>
+        <w:t xml:space="preserve">entre sí, </w:t>
+      </w:r>
+      <w:r>
+        <w:rPr>
+          <w:rFonts w:ascii="Times New Roman" w:eastAsia="Times New Roman" w:hAnsi="Times New Roman" w:cs="Times New Roman"/>
+          <w:sz w:val="24"/>
+          <w:szCs w:val="24"/>
+          <w:lang w:val="es-CO"/>
+        </w:rPr>
+        <w:t xml:space="preserve">para llevar al estudiante de manera secuencial a consolidar la comprensión y adquisición de </w:t>
+      </w:r>
+      <w:r>
+        <w:rPr>
+          <w:rFonts w:ascii="Times New Roman" w:eastAsia="Times New Roman" w:hAnsi="Times New Roman" w:cs="Times New Roman"/>
+          <w:sz w:val="24"/>
+          <w:szCs w:val="24"/>
+          <w:lang w:val="es-CO"/>
+        </w:rPr>
+        <w:t xml:space="preserve">habilidades de constitución de modelos predictivos de machine </w:t>
+      </w:r>
+      <w:proofErr w:type="spellStart"/>
+      <w:r>
+        <w:rPr>
+          <w:rFonts w:ascii="Times New Roman" w:eastAsia="Times New Roman" w:hAnsi="Times New Roman" w:cs="Times New Roman"/>
+          <w:sz w:val="24"/>
+          <w:szCs w:val="24"/>
+          <w:lang w:val="es-CO"/>
+        </w:rPr>
+        <w:t>learning</w:t>
+      </w:r>
+      <w:proofErr w:type="spellEnd"/>
+      <w:r>
+        <w:rPr>
+          <w:rFonts w:ascii="Times New Roman" w:eastAsia="Times New Roman" w:hAnsi="Times New Roman" w:cs="Times New Roman"/>
+          <w:sz w:val="24"/>
+          <w:szCs w:val="24"/>
+          <w:lang w:val="es-CO"/>
+        </w:rPr>
+        <w:t xml:space="preserve">. </w:t>
       </w:r>
     </w:p>
     <w:p>
@@ -1282,7 +2049,6 @@
           <w:szCs w:val="24"/>
           <w:lang w:val="es-CO"/>
         </w:rPr>
-        <w:lastRenderedPageBreak/>
         <w:t>Aportes de la unidad académica o administrativa</w:t>
       </w:r>
     </w:p>
@@ -1312,7 +2078,45 @@
           <w:szCs w:val="24"/>
           <w:lang w:val="es-CO"/>
         </w:rPr>
-        <w:t xml:space="preserve">diseña los cuadernos Jupyter y edita los videos asociados. </w:t>
+        <w:t xml:space="preserve">diseña los cuadernos </w:t>
+      </w:r>
+      <w:proofErr w:type="spellStart"/>
+      <w:r>
+        <w:rPr>
+          <w:rFonts w:ascii="Times New Roman" w:eastAsia="Times New Roman" w:hAnsi="Times New Roman" w:cs="Times New Roman"/>
+          <w:sz w:val="24"/>
+          <w:szCs w:val="24"/>
+          <w:lang w:val="es-CO"/>
+        </w:rPr>
+        <w:t>Jupyter</w:t>
+      </w:r>
+      <w:proofErr w:type="spellEnd"/>
+      <w:r>
+        <w:rPr>
+          <w:rFonts w:ascii="Times New Roman" w:eastAsia="Times New Roman" w:hAnsi="Times New Roman" w:cs="Times New Roman"/>
+          <w:sz w:val="24"/>
+          <w:szCs w:val="24"/>
+          <w:lang w:val="es-CO"/>
+        </w:rPr>
+        <w:t xml:space="preserve"> y </w:t>
+      </w:r>
+      <w:r>
+        <w:rPr>
+          <w:rFonts w:ascii="Times New Roman" w:eastAsia="Times New Roman" w:hAnsi="Times New Roman" w:cs="Times New Roman"/>
+          <w:sz w:val="24"/>
+          <w:szCs w:val="24"/>
+          <w:lang w:val="es-CO"/>
+        </w:rPr>
+        <w:t xml:space="preserve">crea y </w:t>
+      </w:r>
+      <w:r>
+        <w:rPr>
+          <w:rFonts w:ascii="Times New Roman" w:eastAsia="Times New Roman" w:hAnsi="Times New Roman" w:cs="Times New Roman"/>
+          <w:sz w:val="24"/>
+          <w:szCs w:val="24"/>
+          <w:lang w:val="es-CO"/>
+        </w:rPr>
+        <w:t xml:space="preserve">edita los videos asociados. </w:t>
       </w:r>
     </w:p>
     <w:p>
@@ -1384,7 +2188,47 @@
           <w:szCs w:val="24"/>
           <w:lang w:val="es-CO"/>
         </w:rPr>
-        <w:t>Luz Mariela lopez Nohava: Bibliotecóloga y magister experta en bases de datos</w:t>
+        <w:t xml:space="preserve">Luz Mariela </w:t>
+      </w:r>
+      <w:proofErr w:type="spellStart"/>
+      <w:r>
+        <w:rPr>
+          <w:rFonts w:ascii="Times New Roman" w:eastAsia="Times New Roman" w:hAnsi="Times New Roman" w:cs="Times New Roman"/>
+          <w:sz w:val="24"/>
+          <w:szCs w:val="24"/>
+          <w:lang w:val="es-CO"/>
+        </w:rPr>
+        <w:t>lopez</w:t>
+      </w:r>
+      <w:proofErr w:type="spellEnd"/>
+      <w:r>
+        <w:rPr>
+          <w:rFonts w:ascii="Times New Roman" w:eastAsia="Times New Roman" w:hAnsi="Times New Roman" w:cs="Times New Roman"/>
+          <w:sz w:val="24"/>
+          <w:szCs w:val="24"/>
+          <w:lang w:val="es-CO"/>
+        </w:rPr>
+        <w:t xml:space="preserve"> </w:t>
+      </w:r>
+      <w:proofErr w:type="spellStart"/>
+      <w:r>
+        <w:rPr>
+          <w:rFonts w:ascii="Times New Roman" w:eastAsia="Times New Roman" w:hAnsi="Times New Roman" w:cs="Times New Roman"/>
+          <w:sz w:val="24"/>
+          <w:szCs w:val="24"/>
+          <w:lang w:val="es-CO"/>
+        </w:rPr>
+        <w:t>Nohava</w:t>
+      </w:r>
+      <w:proofErr w:type="spellEnd"/>
+      <w:r>
+        <w:rPr>
+          <w:rFonts w:ascii="Times New Roman" w:eastAsia="Times New Roman" w:hAnsi="Times New Roman" w:cs="Times New Roman"/>
+          <w:sz w:val="24"/>
+          <w:szCs w:val="24"/>
+          <w:lang w:val="es-CO"/>
+        </w:rPr>
+        <w:t>: Bibliotecóloga y magister experta en bases de datos</w:t>
       </w:r>
       <w:r>
         <w:rPr>
@@ -1440,7 +2284,27 @@
           <w:szCs w:val="24"/>
           <w:lang w:val="es-CO"/>
         </w:rPr>
-        <w:t>y productor de la cartilla didáctica para la enseñanza del Machine learning en la universidad de Antioquia</w:t>
+        <w:t xml:space="preserve">y productor de la cartilla didáctica para la enseñanza del Machine </w:t>
+      </w:r>
+      <w:proofErr w:type="spellStart"/>
+      <w:r>
+        <w:rPr>
+          <w:rFonts w:ascii="Times New Roman" w:eastAsia="Times New Roman" w:hAnsi="Times New Roman" w:cs="Times New Roman"/>
+          <w:sz w:val="24"/>
+          <w:szCs w:val="24"/>
+          <w:lang w:val="es-CO"/>
+        </w:rPr>
+        <w:t>learning</w:t>
+      </w:r>
+      <w:proofErr w:type="spellEnd"/>
+      <w:r>
+        <w:rPr>
+          <w:rFonts w:ascii="Times New Roman" w:eastAsia="Times New Roman" w:hAnsi="Times New Roman" w:cs="Times New Roman"/>
+          <w:sz w:val="24"/>
+          <w:szCs w:val="24"/>
+          <w:lang w:val="es-CO"/>
+        </w:rPr>
+        <w:t xml:space="preserve"> en la universidad de Antioquia</w:t>
       </w:r>
       <w:r>
         <w:rPr>
@@ -1667,7 +2531,27 @@
           <w:szCs w:val="24"/>
           <w:lang w:val="es-CO"/>
         </w:rPr>
-        <w:t xml:space="preserve">El profesor Marco Julio Cañas ha sido Profesor del área de machine learning </w:t>
+        <w:t xml:space="preserve">El profesor Marco Julio Cañas ha sido Profesor del área de machine </w:t>
+      </w:r>
+      <w:proofErr w:type="spellStart"/>
+      <w:r>
+        <w:rPr>
+          <w:rFonts w:ascii="Times New Roman" w:eastAsia="Times New Roman" w:hAnsi="Times New Roman" w:cs="Times New Roman"/>
+          <w:sz w:val="24"/>
+          <w:szCs w:val="24"/>
+          <w:lang w:val="es-CO"/>
+        </w:rPr>
+        <w:t>learning</w:t>
+      </w:r>
+      <w:proofErr w:type="spellEnd"/>
+      <w:r>
+        <w:rPr>
+          <w:rFonts w:ascii="Times New Roman" w:eastAsia="Times New Roman" w:hAnsi="Times New Roman" w:cs="Times New Roman"/>
+          <w:sz w:val="24"/>
+          <w:szCs w:val="24"/>
+          <w:lang w:val="es-CO"/>
+        </w:rPr>
+        <w:t xml:space="preserve"> </w:t>
       </w:r>
       <w:r>
         <w:rPr>
@@ -1695,6 +2579,77 @@
           <w:lang w:val="es-CO"/>
         </w:rPr>
         <w:t xml:space="preserve">durante los últimos tres años. </w:t>
+      </w:r>
+    </w:p>
+    <w:p>
+      <w:pPr>
+        <w:pStyle w:val="ListParagraph"/>
+        <w:rPr>
+          <w:rFonts w:ascii="Times New Roman" w:eastAsia="Times New Roman" w:hAnsi="Times New Roman" w:cs="Times New Roman"/>
+          <w:sz w:val="24"/>
+          <w:szCs w:val="24"/>
+          <w:lang w:val="es-CO"/>
+        </w:rPr>
+      </w:pPr>
+    </w:p>
+    <w:p>
+      <w:pPr>
+        <w:pStyle w:val="ListParagraph"/>
+        <w:rPr>
+          <w:rFonts w:ascii="Times New Roman" w:eastAsia="Times New Roman" w:hAnsi="Times New Roman" w:cs="Times New Roman"/>
+          <w:sz w:val="24"/>
+          <w:szCs w:val="24"/>
+          <w:lang w:val="es-CO"/>
+        </w:rPr>
+      </w:pPr>
+      <w:r>
+        <w:rPr>
+          <w:rFonts w:ascii="Times New Roman" w:eastAsia="Times New Roman" w:hAnsi="Times New Roman" w:cs="Times New Roman"/>
+          <w:sz w:val="24"/>
+          <w:szCs w:val="24"/>
+          <w:lang w:val="es-CO"/>
+        </w:rPr>
+        <w:t xml:space="preserve">La profesora Luz Mariela </w:t>
+      </w:r>
+      <w:proofErr w:type="spellStart"/>
+      <w:r>
+        <w:rPr>
+          <w:rFonts w:ascii="Times New Roman" w:eastAsia="Times New Roman" w:hAnsi="Times New Roman" w:cs="Times New Roman"/>
+          <w:sz w:val="24"/>
+          <w:szCs w:val="24"/>
+          <w:lang w:val="es-CO"/>
+        </w:rPr>
+        <w:t>Lopez</w:t>
+      </w:r>
+      <w:proofErr w:type="spellEnd"/>
+      <w:r>
+        <w:rPr>
+          <w:rFonts w:ascii="Times New Roman" w:eastAsia="Times New Roman" w:hAnsi="Times New Roman" w:cs="Times New Roman"/>
+          <w:sz w:val="24"/>
+          <w:szCs w:val="24"/>
+          <w:lang w:val="es-CO"/>
+        </w:rPr>
+        <w:t xml:space="preserve"> </w:t>
+      </w:r>
+      <w:proofErr w:type="spellStart"/>
+      <w:r>
+        <w:rPr>
+          <w:rFonts w:ascii="Times New Roman" w:eastAsia="Times New Roman" w:hAnsi="Times New Roman" w:cs="Times New Roman"/>
+          <w:sz w:val="24"/>
+          <w:szCs w:val="24"/>
+          <w:lang w:val="es-CO"/>
+        </w:rPr>
+        <w:t>Nohava</w:t>
+      </w:r>
+      <w:proofErr w:type="spellEnd"/>
+      <w:r>
+        <w:rPr>
+          <w:rFonts w:ascii="Times New Roman" w:eastAsia="Times New Roman" w:hAnsi="Times New Roman" w:cs="Times New Roman"/>
+          <w:sz w:val="24"/>
+          <w:szCs w:val="24"/>
+          <w:lang w:val="es-CO"/>
+        </w:rPr>
+        <w:t xml:space="preserve"> es bibliotecóloga experta en consulta en bases de datos académicas. </w:t>
       </w:r>
       <w:r>
         <w:rPr>
@@ -1732,6 +2687,7 @@
           <w:szCs w:val="24"/>
         </w:rPr>
       </w:pPr>
+      <w:proofErr w:type="spellStart"/>
       <w:r>
         <w:rPr>
           <w:rFonts w:ascii="Times New Roman" w:eastAsia="Times New Roman" w:hAnsi="Times New Roman" w:cs="Times New Roman"/>
@@ -1742,6 +2698,7 @@
         </w:rPr>
         <w:t>Bibliografía</w:t>
       </w:r>
+      <w:proofErr w:type="spellEnd"/>
     </w:p>
     <w:p>
       <w:pPr>
@@ -1761,15 +2718,36 @@
         </w:rPr>
         <w:t> </w:t>
       </w:r>
-      <w:r>
-        <w:t xml:space="preserve">Géron, A. (2022). </w:t>
+      <w:proofErr w:type="spellStart"/>
+      <w:r>
+        <w:t>Géron</w:t>
+      </w:r>
+      <w:proofErr w:type="spellEnd"/>
+      <w:r>
+        <w:t xml:space="preserve">, A. (2022). </w:t>
       </w:r>
       <w:r>
         <w:rPr>
           <w:i/>
           <w:iCs/>
         </w:rPr>
-        <w:t>Hands-on machine learning with Scikit-Learn, Keras, and TensorFlow</w:t>
+        <w:t xml:space="preserve">Hands-on machine learning with Scikit-Learn, </w:t>
+      </w:r>
+      <w:proofErr w:type="spellStart"/>
+      <w:r>
+        <w:rPr>
+          <w:i/>
+          <w:iCs/>
+        </w:rPr>
+        <w:t>Keras</w:t>
+      </w:r>
+      <w:proofErr w:type="spellEnd"/>
+      <w:r>
+        <w:rPr>
+          <w:i/>
+          <w:iCs/>
+        </w:rPr>
+        <w:t>, and TensorFlow</w:t>
       </w:r>
       <w:r>
         <w:t xml:space="preserve">. </w:t>
@@ -1793,161 +2771,195 @@
       <w:pPr>
         <w:spacing w:beforeAutospacing="1" w:afterAutospacing="1" w:line="240" w:lineRule="auto"/>
         <w:rPr>
-          <w:lang w:val="es-CO"/>
-        </w:rPr>
-      </w:pPr>
-      <w:r>
-        <w:rPr>
           <w:rFonts w:ascii="Calibri" w:eastAsia="Calibri" w:hAnsi="Calibri" w:cs="Calibri"/>
           <w:lang w:val="es-CO"/>
         </w:rPr>
+      </w:pPr>
+      <w:r>
+        <w:rPr>
+          <w:rFonts w:ascii="Calibri" w:eastAsia="Calibri" w:hAnsi="Calibri" w:cs="Calibri"/>
+          <w:lang w:val="es-CO"/>
+        </w:rPr>
+        <w:t>Calderón Piedras, S. Guía metodológica introductoria a la ciencia de datos.</w:t>
+      </w:r>
+    </w:p>
+    <w:p>
+      <w:pPr>
+        <w:spacing w:beforeAutospacing="1" w:afterAutospacing="1" w:line="240" w:lineRule="auto"/>
+        <w:rPr>
+          <w:rFonts w:ascii="Calibri" w:eastAsia="Calibri" w:hAnsi="Calibri" w:cs="Calibri"/>
+          <w:lang w:val="es-CO"/>
+        </w:rPr>
+      </w:pPr>
+    </w:p>
+    <w:p>
+      <w:pPr>
+        <w:spacing w:beforeAutospacing="1" w:afterAutospacing="1" w:line="240" w:lineRule="auto"/>
+        <w:rPr>
+          <w:lang w:val="es-CO"/>
+        </w:rPr>
+      </w:pPr>
+      <w:r>
+        <w:rPr>
+          <w:lang w:val="es-CO"/>
+        </w:rPr>
+        <w:t xml:space="preserve">Müller, A. C., &amp; Guido, S. (2016). </w:t>
+      </w:r>
+      <w:r>
+        <w:rPr>
+          <w:i/>
+          <w:iCs/>
+        </w:rPr>
+        <w:t>Introduction to machine learning with Python: a guide for data scientists</w:t>
+      </w:r>
+      <w:r>
+        <w:t>. " O'Reilly Media, Inc.".</w:t>
+      </w:r>
+    </w:p>
+    <w:p>
+      <w:pPr>
+        <w:rPr>
+          <w:lang w:val="es-CO"/>
+        </w:rPr>
+      </w:pPr>
+    </w:p>
+    <w:p>
+      <w:pPr>
+        <w:rPr>
+          <w:lang w:val="es-CO"/>
+        </w:rPr>
+      </w:pPr>
+    </w:p>
+    <w:p>
+      <w:pPr>
+        <w:rPr>
+          <w:lang w:val="es-CO"/>
+        </w:rPr>
+      </w:pPr>
+    </w:p>
+    <w:p>
+      <w:pPr>
+        <w:rPr>
+          <w:lang w:val="es-CO"/>
+        </w:rPr>
+      </w:pPr>
+    </w:p>
+    <w:p>
+      <w:pPr>
+        <w:rPr>
+          <w:lang w:val="es-CO"/>
+        </w:rPr>
+      </w:pPr>
+    </w:p>
+    <w:p>
+      <w:pPr>
+        <w:rPr>
+          <w:lang w:val="es-CO"/>
+        </w:rPr>
+      </w:pPr>
+    </w:p>
+    <w:p>
+      <w:pPr>
+        <w:rPr>
+          <w:lang w:val="es-CO"/>
+        </w:rPr>
+      </w:pPr>
+    </w:p>
+    <w:p>
+      <w:pPr>
+        <w:rPr>
+          <w:lang w:val="es-CO"/>
+        </w:rPr>
+      </w:pPr>
+    </w:p>
+    <w:p>
+      <w:pPr>
+        <w:rPr>
+          <w:lang w:val="es-CO"/>
+        </w:rPr>
+      </w:pPr>
+    </w:p>
+    <w:p>
+      <w:pPr>
+        <w:rPr>
+          <w:lang w:val="es-CO"/>
+        </w:rPr>
+      </w:pPr>
+    </w:p>
+    <w:p>
+      <w:pPr>
+        <w:rPr>
+          <w:lang w:val="es-CO"/>
+        </w:rPr>
+      </w:pPr>
+    </w:p>
+    <w:p>
+      <w:pPr>
+        <w:rPr>
+          <w:lang w:val="es-CO"/>
+        </w:rPr>
+      </w:pPr>
+    </w:p>
+    <w:p>
+      <w:pPr>
+        <w:rPr>
+          <w:lang w:val="es-CO"/>
+        </w:rPr>
+      </w:pPr>
+    </w:p>
+    <w:p>
+      <w:pPr>
+        <w:rPr>
+          <w:lang w:val="es-CO"/>
+        </w:rPr>
+      </w:pPr>
+    </w:p>
+    <w:p>
+      <w:pPr>
+        <w:rPr>
+          <w:lang w:val="es-CO"/>
+        </w:rPr>
+      </w:pPr>
+    </w:p>
+    <w:p>
+      <w:pPr>
+        <w:rPr>
+          <w:lang w:val="es-CO"/>
+        </w:rPr>
+      </w:pPr>
+    </w:p>
+    <w:p>
+      <w:pPr>
+        <w:rPr>
+          <w:lang w:val="es-CO"/>
+        </w:rPr>
+      </w:pPr>
+    </w:p>
+    <w:p>
+      <w:pPr>
+        <w:rPr>
+          <w:lang w:val="es-CO"/>
+        </w:rPr>
+      </w:pPr>
+    </w:p>
+    <w:p>
+      <w:pPr>
+        <w:rPr>
+          <w:lang w:val="es-CO"/>
+        </w:rPr>
+      </w:pPr>
+    </w:p>
+    <w:p>
+      <w:pPr>
+        <w:rPr>
+          <w:lang w:val="es-CO"/>
+        </w:rPr>
+      </w:pPr>
+      <w:r>
+        <w:rPr>
+          <w:lang w:val="es-CO"/>
+        </w:rPr>
         <w:lastRenderedPageBreak/>
-        <w:t>Calderón Piedras, S. Guía metodológica introductoria a la ciencia de datos.</w:t>
-      </w:r>
-    </w:p>
-    <w:p>
-      <w:pPr>
-        <w:rPr>
-          <w:lang w:val="es-CO"/>
-        </w:rPr>
-      </w:pPr>
-    </w:p>
-    <w:p>
-      <w:pPr>
-        <w:rPr>
-          <w:lang w:val="es-CO"/>
-        </w:rPr>
-      </w:pPr>
-    </w:p>
-    <w:p>
-      <w:pPr>
-        <w:rPr>
-          <w:lang w:val="es-CO"/>
-        </w:rPr>
-      </w:pPr>
-    </w:p>
-    <w:p>
-      <w:pPr>
-        <w:rPr>
-          <w:lang w:val="es-CO"/>
-        </w:rPr>
-      </w:pPr>
-    </w:p>
-    <w:p>
-      <w:pPr>
-        <w:rPr>
-          <w:lang w:val="es-CO"/>
-        </w:rPr>
-      </w:pPr>
-    </w:p>
-    <w:p>
-      <w:pPr>
-        <w:rPr>
-          <w:lang w:val="es-CO"/>
-        </w:rPr>
-      </w:pPr>
-    </w:p>
-    <w:p>
-      <w:pPr>
-        <w:rPr>
-          <w:lang w:val="es-CO"/>
-        </w:rPr>
-      </w:pPr>
-    </w:p>
-    <w:p>
-      <w:pPr>
-        <w:rPr>
-          <w:lang w:val="es-CO"/>
-        </w:rPr>
-      </w:pPr>
-    </w:p>
-    <w:p>
-      <w:pPr>
-        <w:rPr>
-          <w:lang w:val="es-CO"/>
-        </w:rPr>
-      </w:pPr>
-    </w:p>
-    <w:p>
-      <w:pPr>
-        <w:rPr>
-          <w:lang w:val="es-CO"/>
-        </w:rPr>
-      </w:pPr>
-    </w:p>
-    <w:p>
-      <w:pPr>
-        <w:rPr>
-          <w:lang w:val="es-CO"/>
-        </w:rPr>
-      </w:pPr>
-    </w:p>
-    <w:p>
-      <w:pPr>
-        <w:rPr>
-          <w:lang w:val="es-CO"/>
-        </w:rPr>
-      </w:pPr>
-    </w:p>
-    <w:p>
-      <w:pPr>
-        <w:rPr>
-          <w:lang w:val="es-CO"/>
-        </w:rPr>
-      </w:pPr>
-    </w:p>
-    <w:p>
-      <w:pPr>
-        <w:rPr>
-          <w:lang w:val="es-CO"/>
-        </w:rPr>
-      </w:pPr>
-    </w:p>
-    <w:p>
-      <w:pPr>
-        <w:rPr>
-          <w:lang w:val="es-CO"/>
-        </w:rPr>
-      </w:pPr>
-    </w:p>
-    <w:p>
-      <w:pPr>
-        <w:rPr>
-          <w:lang w:val="es-CO"/>
-        </w:rPr>
-      </w:pPr>
-    </w:p>
-    <w:p>
-      <w:pPr>
-        <w:rPr>
-          <w:lang w:val="es-CO"/>
-        </w:rPr>
-      </w:pPr>
-    </w:p>
-    <w:p>
-      <w:pPr>
-        <w:rPr>
-          <w:lang w:val="es-CO"/>
-        </w:rPr>
-      </w:pPr>
-    </w:p>
-    <w:p>
-      <w:pPr>
-        <w:rPr>
-          <w:lang w:val="es-CO"/>
-        </w:rPr>
-      </w:pPr>
-    </w:p>
-    <w:p>
-      <w:pPr>
-        <w:rPr>
-          <w:lang w:val="es-CO"/>
-        </w:rPr>
-      </w:pPr>
-      <w:r>
-        <w:rPr>
-          <w:lang w:val="es-CO"/>
-        </w:rPr>
         <w:t>Referentes</w:t>
       </w:r>
     </w:p>
@@ -1967,14 +2979,7 @@
         <w:rPr>
           <w:lang w:val="es-CO"/>
         </w:rPr>
-        <w:t>https://www.udea.edu.co/wps/portal/udea/web/generales/interna/!ut/p/z1/1ZTLctowFIZfBRZZenQ1NkvhuCbmYgwhxNp0hC0atWATWzhpnr7ywLS5Ae2kXVQb64y-c_ulY8DBLeC5qNUXoVWRi7WxE9757HY9jBiFw2AaepB1POY7s5shdjFYvATgANmQxf5kfB15k8sQA26Ox7HtI-wZfxtTGIcUDS4ZgTNCD_7wyGLw9_xPAPx0_TeAA57meqvvQLItSi3Wu0yKCyiql9ZdsZH7vXzUMq-MPj-37ZS0lyRvyby1Fq09lRZ5XaRCF6USVesVuMtVLctKaWFOm-iGNoDKisbIZKVFKrKiuoC1KvVOrNWTSE1G3FS7TVUGEkS6hkmptXLh0qLOElluJ82sbkd2qXSxg1bL17fztn1-WvxFk--5vlHf_QTj4Jr2KWV9l9H3ATgd9YLYRz613wBXxIdxd2xPSHCFqUMOwKkndK7MxLTpHG0zQmBRK_kA5nlRbsyjnv2hiv1zGSj8YIZ9-F8aQWw0inphMBwhGHn4r4Q_Wj36p-EHH60-PDfD5ielvt7fc2YmuZmjRw1u_4NR3m7m8_nGJd-tb1N_NfIJTcL6qTe2Dh-</w:t>
-      </w:r>
-      <w:r>
-        <w:rPr>
-          <w:lang w:val="es-CO"/>
-        </w:rPr>
-        <w:lastRenderedPageBreak/>
-        <w:t>esPYPzabWWw!!/dz/d5/L2dBISEvZ0FBIS9nQSEh/?page=udea.generales.interna&amp;urile=wcm:path:/PortalUdeA/asPortalUdeA/asHomeUdeA/Extension/Extensi%2521c3%2521b3n%2Ben%2Bla%2BUdeA/Convocatorias%2Bextensi%2521c3%2521b3n%2Buniversitaria/asContenido/asDestacados/virtualizacion2</w:t>
+        <w:t>https://www.udea.edu.co/wps/portal/udea/web/generales/interna/!ut/p/z1/1ZTLctowFIZfBRZZenQ1NkvhuCbmYgwhxNp0hC0atWATWzhpnr7ywLS5Ae2kXVQb64y-c_ulY8DBLeC5qNUXoVWRi7WxE9757HY9jBiFw2AaepB1POY7s5shdjFYvATgANmQxf5kfB15k8sQA26Ox7HtI-wZfxtTGIcUDS4ZgTNCD_7wyGLw9_xPAPx0_TeAA57meqvvQLItSi3Wu0yKCyiql9ZdsZH7vXzUMq-MPj-37ZS0lyRvyby1Fq09lRZ5XaRCF6USVesVuMtVLctKaWFOm-iGNoDKisbIZKVFKrKiuoC1KvVOrNWTSE1G3FS7TVUGEkS6hkmptXLh0qLOElluJ82sbkd2qXSxg1bL17fztn1-WvxFk--5vlHf_QTj4Jr2KWV9l9H3ATgd9YLYRz613wBXxIdxd2xPSHCFqUMOwKkndK7MxLTpHG0zQmBRK_kA5nlRbsyjnv2hiv1zGSj8YIZ9-F8aQWw0inphMBwhGHn4r4Q_Wj36p-EHH60-PDfD5ielvt7fc2YmuZmjRw1u_4NR3m7m8_nGJd-tb1N_NfIJTcL6qTe2Dh-esPYPzabWWw!!/dz/d5/L2dBISEvZ0FBIS9nQSEh/?page=udea.generales.interna&amp;urile=wcm:path:/PortalUdeA/asPortalUdeA/asHomeUdeA/Extension/Extensi%2521c3%2521b3n%2Ben%2Bla%2BUdeA/Convocatorias%2Bextensi%2521c3%2521b3n%2Buniversitaria/asContenido/asDestacados/virtualizacion2</w:t>
       </w:r>
     </w:p>
     <w:sectPr>
@@ -1990,6 +2995,95 @@
 <file path=word/numbering.xml><?xml version="1.0" encoding="utf-8"?>
 <w:numbering xmlns:wpc="http://schemas.microsoft.com/office/word/2010/wordprocessingCanvas" xmlns:cx="http://schemas.microsoft.com/office/drawing/2014/chartex" xmlns:cx1="http://schemas.microsoft.com/office/drawing/2015/9/8/chartex" xmlns:cx2="http://schemas.microsoft.com/office/drawing/2015/10/21/chartex" xmlns:cx3="http://schemas.microsoft.com/office/drawing/2016/5/9/chartex" xmlns:cx4="http://schemas.microsoft.com/office/drawing/2016/5/10/chartex" xmlns:cx5="http://schemas.microsoft.com/office/drawing/2016/5/11/chartex" xmlns:cx6="http://schemas.microsoft.com/office/drawing/2016/5/12/chartex" xmlns:cx7="http://schemas.microsoft.com/office/drawing/2016/5/13/chartex" xmlns:cx8="http://schemas.microsoft.com/office/drawing/2016/5/14/chartex" xmlns:mc="http://schemas.openxmlformats.org/markup-compatibility/2006" xmlns:aink="http://schemas.microsoft.com/office/drawing/2016/ink" xmlns:am3d="http://schemas.microsoft.com/office/drawing/2017/model3d" xmlns:o="urn:schemas-microsoft-com:office:office" xmlns:oel="http://schemas.microsoft.com/office/2019/extlst" xmlns:r="http://schemas.openxmlformats.org/officeDocument/2006/relationships" xmlns:m="http://schemas.openxmlformats.org/officeDocument/2006/math" xmlns:v="urn:schemas-microsoft-com:vml" xmlns:wp14="http://schemas.microsoft.com/office/word/2010/wordprocessingDrawing" xmlns:wp="http://schemas.openxmlformats.org/drawingml/2006/wordprocessingDrawing" xmlns:w10="urn:schemas-microsoft-com:office:word" xmlns:w="http://schemas.openxmlformats.org/wordprocessingml/2006/main" xmlns:w14="http://schemas.microsoft.com/office/word/2010/wordml" xmlns:w15="http://schemas.microsoft.com/office/word/2012/wordml" xmlns:w16cex="http://schemas.microsoft.com/office/word/2018/wordml/cex" xmlns:w16cid="http://schemas.microsoft.com/office/word/2016/wordml/cid" xmlns:w16="http://schemas.microsoft.com/office/word/2018/wordml" xmlns:w16sdtdh="http://schemas.microsoft.com/office/word/2020/wordml/sdtdatahash" xmlns:w16se="http://schemas.microsoft.com/office/word/2015/wordml/symex" xmlns:wpg="http://schemas.microsoft.com/office/word/2010/wordprocessingGroup" xmlns:wpi="http://schemas.microsoft.com/office/word/2010/wordprocessingInk" xmlns:wne="http://schemas.microsoft.com/office/word/2006/wordml" xmlns:wps="http://schemas.microsoft.com/office/word/2010/wordprocessingShape" mc:Ignorable="w14 w15 w16se w16cid w16 w16cex w16sdtdh wp14">
   <w:abstractNum w:abstractNumId="0" w15:restartNumberingAfterBreak="0">
+    <w:nsid w:val="16F021CF"/>
+    <w:multiLevelType w:val="hybridMultilevel"/>
+    <w:tmpl w:val="3FAAEF9C"/>
+    <w:lvl w:ilvl="0" w:tplc="0409000F">
+      <w:start w:val="1"/>
+      <w:numFmt w:val="decimal"/>
+      <w:lvlText w:val="%1."/>
+      <w:lvlJc w:val="left"/>
+      <w:pPr>
+        <w:ind w:left="720" w:hanging="360"/>
+      </w:pPr>
+      <w:rPr>
+        <w:rFonts w:hint="default"/>
+      </w:rPr>
+    </w:lvl>
+    <w:lvl w:ilvl="1" w:tplc="04090019" w:tentative="1">
+      <w:start w:val="1"/>
+      <w:numFmt w:val="lowerLetter"/>
+      <w:lvlText w:val="%2."/>
+      <w:lvlJc w:val="left"/>
+      <w:pPr>
+        <w:ind w:left="1440" w:hanging="360"/>
+      </w:pPr>
+    </w:lvl>
+    <w:lvl w:ilvl="2" w:tplc="0409001B" w:tentative="1">
+      <w:start w:val="1"/>
+      <w:numFmt w:val="lowerRoman"/>
+      <w:lvlText w:val="%3."/>
+      <w:lvlJc w:val="right"/>
+      <w:pPr>
+        <w:ind w:left="2160" w:hanging="180"/>
+      </w:pPr>
+    </w:lvl>
+    <w:lvl w:ilvl="3" w:tplc="0409000F" w:tentative="1">
+      <w:start w:val="1"/>
+      <w:numFmt w:val="decimal"/>
+      <w:lvlText w:val="%4."/>
+      <w:lvlJc w:val="left"/>
+      <w:pPr>
+        <w:ind w:left="2880" w:hanging="360"/>
+      </w:pPr>
+    </w:lvl>
+    <w:lvl w:ilvl="4" w:tplc="04090019" w:tentative="1">
+      <w:start w:val="1"/>
+      <w:numFmt w:val="lowerLetter"/>
+      <w:lvlText w:val="%5."/>
+      <w:lvlJc w:val="left"/>
+      <w:pPr>
+        <w:ind w:left="3600" w:hanging="360"/>
+      </w:pPr>
+    </w:lvl>
+    <w:lvl w:ilvl="5" w:tplc="0409001B" w:tentative="1">
+      <w:start w:val="1"/>
+      <w:numFmt w:val="lowerRoman"/>
+      <w:lvlText w:val="%6."/>
+      <w:lvlJc w:val="right"/>
+      <w:pPr>
+        <w:ind w:left="4320" w:hanging="180"/>
+      </w:pPr>
+    </w:lvl>
+    <w:lvl w:ilvl="6" w:tplc="0409000F" w:tentative="1">
+      <w:start w:val="1"/>
+      <w:numFmt w:val="decimal"/>
+      <w:lvlText w:val="%7."/>
+      <w:lvlJc w:val="left"/>
+      <w:pPr>
+        <w:ind w:left="5040" w:hanging="360"/>
+      </w:pPr>
+    </w:lvl>
+    <w:lvl w:ilvl="7" w:tplc="04090019" w:tentative="1">
+      <w:start w:val="1"/>
+      <w:numFmt w:val="lowerLetter"/>
+      <w:lvlText w:val="%8."/>
+      <w:lvlJc w:val="left"/>
+      <w:pPr>
+        <w:ind w:left="5760" w:hanging="360"/>
+      </w:pPr>
+    </w:lvl>
+    <w:lvl w:ilvl="8" w:tplc="0409001B" w:tentative="1">
+      <w:start w:val="1"/>
+      <w:numFmt w:val="lowerRoman"/>
+      <w:lvlText w:val="%9."/>
+      <w:lvlJc w:val="right"/>
+      <w:pPr>
+        <w:ind w:left="6480" w:hanging="180"/>
+      </w:pPr>
+    </w:lvl>
+  </w:abstractNum>
+  <w:abstractNum w:abstractNumId="1" w15:restartNumberingAfterBreak="0">
     <w:nsid w:val="38781211"/>
     <w:multiLevelType w:val="hybridMultilevel"/>
     <w:tmpl w:val="7FAEA636"/>
@@ -2102,7 +3196,7 @@
       </w:rPr>
     </w:lvl>
   </w:abstractNum>
-  <w:abstractNum w:abstractNumId="1" w15:restartNumberingAfterBreak="0">
+  <w:abstractNum w:abstractNumId="2" w15:restartNumberingAfterBreak="0">
     <w:nsid w:val="3AE179F1"/>
     <w:multiLevelType w:val="hybridMultilevel"/>
     <w:tmpl w:val="89E0C8D2"/>
@@ -2191,7 +3285,7 @@
       </w:pPr>
     </w:lvl>
   </w:abstractNum>
-  <w:abstractNum w:abstractNumId="2" w15:restartNumberingAfterBreak="0">
+  <w:abstractNum w:abstractNumId="3" w15:restartNumberingAfterBreak="0">
     <w:nsid w:val="516B39FD"/>
     <w:multiLevelType w:val="multilevel"/>
     <w:tmpl w:val="ADE6FD2A"/>
@@ -2341,12 +3435,15 @@
     </w:lvl>
   </w:abstractNum>
   <w:num w:numId="1" w16cid:durableId="1786970595">
+    <w:abstractNumId w:val="3"/>
+  </w:num>
+  <w:num w:numId="2" w16cid:durableId="1286889760">
     <w:abstractNumId w:val="2"/>
   </w:num>
-  <w:num w:numId="2" w16cid:durableId="1286889760">
+  <w:num w:numId="3" w16cid:durableId="1728793829">
     <w:abstractNumId w:val="1"/>
   </w:num>
-  <w:num w:numId="3" w16cid:durableId="1728793829">
+  <w:num w:numId="4" w16cid:durableId="1537507080">
     <w:abstractNumId w:val="0"/>
   </w:num>
 </w:numbering>

</xml_diff>

<commit_message>
adición de cuaderno sobre digitalización de imagenes
</commit_message>
<xml_diff>
--- a/propuesta/prop_invest/virtualizacion/curso_machine_learning_virtualizar.docx
+++ b/propuesta/prop_invest/virtualizacion/curso_machine_learning_virtualizar.docx
@@ -492,14 +492,18 @@
         <w:spacing w:before="100" w:beforeAutospacing="1" w:after="100" w:afterAutospacing="1" w:line="240" w:lineRule="auto"/>
         <w:rPr>
           <w:rFonts w:ascii="Times New Roman" w:eastAsia="Times New Roman" w:hAnsi="Times New Roman" w:cs="Times New Roman"/>
-          <w:sz w:val="24"/>
-          <w:szCs w:val="24"/>
-          <w:lang w:val="es-CO"/>
-        </w:rPr>
-      </w:pPr>
-      <w:r>
-        <w:rPr>
-          <w:rFonts w:ascii="Times New Roman" w:eastAsia="Times New Roman" w:hAnsi="Times New Roman" w:cs="Times New Roman"/>
+          <w:b/>
+          <w:bCs/>
+          <w:sz w:val="24"/>
+          <w:szCs w:val="24"/>
+          <w:lang w:val="es-CO"/>
+        </w:rPr>
+      </w:pPr>
+      <w:r>
+        <w:rPr>
+          <w:rFonts w:ascii="Times New Roman" w:eastAsia="Times New Roman" w:hAnsi="Times New Roman" w:cs="Times New Roman"/>
+          <w:b/>
+          <w:bCs/>
           <w:sz w:val="24"/>
           <w:szCs w:val="24"/>
           <w:lang w:val="es-CO"/>
@@ -656,16 +660,7 @@
           <w:szCs w:val="24"/>
           <w:lang w:val="es-CO"/>
         </w:rPr>
-        <w:t>L</w:t>
-      </w:r>
-      <w:r>
-        <w:rPr>
-          <w:rFonts w:ascii="Times New Roman" w:eastAsia="Times New Roman" w:hAnsi="Times New Roman" w:cs="Times New Roman"/>
-          <w:sz w:val="24"/>
-          <w:szCs w:val="24"/>
-          <w:lang w:val="es-CO"/>
-        </w:rPr>
-        <w:t xml:space="preserve">as metodologías en análisis de datos se pueden aprender a través de videos cortos que ejemplifiquen la manera de procesar la información con Python y de constituir modelos predictivos de machine </w:t>
+        <w:t xml:space="preserve">* Las metodologías en análisis de datos se pueden aprender a través de videos cortos que ejemplifiquen la manera de procesar la información con Python y de constituir modelos predictivos de machine </w:t>
       </w:r>
       <w:proofErr w:type="spellStart"/>
       <w:r>
@@ -705,25 +700,7 @@
           <w:szCs w:val="24"/>
           <w:lang w:val="es-CO"/>
         </w:rPr>
-        <w:t xml:space="preserve">. </w:t>
-      </w:r>
-      <w:r>
-        <w:rPr>
-          <w:rFonts w:ascii="Times New Roman" w:eastAsia="Times New Roman" w:hAnsi="Times New Roman" w:cs="Times New Roman"/>
-          <w:sz w:val="24"/>
-          <w:szCs w:val="24"/>
-          <w:lang w:val="es-CO"/>
-        </w:rPr>
-        <w:t xml:space="preserve">Esto si los videos están apoyando unos diseños de contenidos </w:t>
-      </w:r>
-      <w:r>
-        <w:rPr>
-          <w:rFonts w:ascii="Times New Roman" w:eastAsia="Times New Roman" w:hAnsi="Times New Roman" w:cs="Times New Roman"/>
-          <w:sz w:val="24"/>
-          <w:szCs w:val="24"/>
-          <w:lang w:val="es-CO"/>
-        </w:rPr>
-        <w:t xml:space="preserve">a través de cuaderno </w:t>
+        <w:t xml:space="preserve">. Esto si los videos están apoyando unos diseños de contenidos a través de cuaderno </w:t>
       </w:r>
       <w:proofErr w:type="spellStart"/>
       <w:r>
@@ -743,26 +720,109 @@
           <w:szCs w:val="24"/>
           <w:lang w:val="es-CO"/>
         </w:rPr>
-        <w:t xml:space="preserve"> para lectura interactiva y experimental. </w:t>
-      </w:r>
-    </w:p>
-    <w:p>
-      <w:pPr>
-        <w:spacing w:before="100" w:beforeAutospacing="1" w:after="100" w:afterAutospacing="1" w:line="240" w:lineRule="auto"/>
-        <w:rPr>
-          <w:rFonts w:ascii="Times New Roman" w:eastAsia="Times New Roman" w:hAnsi="Times New Roman" w:cs="Times New Roman"/>
-          <w:sz w:val="24"/>
-          <w:szCs w:val="24"/>
-          <w:lang w:val="es-CO"/>
-        </w:rPr>
-      </w:pPr>
-      <w:r>
-        <w:rPr>
-          <w:rFonts w:ascii="Times New Roman" w:eastAsia="Times New Roman" w:hAnsi="Times New Roman" w:cs="Times New Roman"/>
-          <w:sz w:val="24"/>
-          <w:szCs w:val="24"/>
-          <w:lang w:val="es-CO"/>
-        </w:rPr>
+        <w:t xml:space="preserve"> para lectura interactiva y experimental y a los cuales el estudiante tiene libre acceso a través de la red social GitHub y vínculo o asociación con la aplicación en línea Google </w:t>
+      </w:r>
+      <w:proofErr w:type="spellStart"/>
+      <w:r>
+        <w:rPr>
+          <w:rFonts w:ascii="Times New Roman" w:eastAsia="Times New Roman" w:hAnsi="Times New Roman" w:cs="Times New Roman"/>
+          <w:sz w:val="24"/>
+          <w:szCs w:val="24"/>
+          <w:lang w:val="es-CO"/>
+        </w:rPr>
+        <w:t>Colab</w:t>
+      </w:r>
+      <w:proofErr w:type="spellEnd"/>
+      <w:r>
+        <w:rPr>
+          <w:rFonts w:ascii="Times New Roman" w:eastAsia="Times New Roman" w:hAnsi="Times New Roman" w:cs="Times New Roman"/>
+          <w:sz w:val="24"/>
+          <w:szCs w:val="24"/>
+          <w:lang w:val="es-CO"/>
+        </w:rPr>
+        <w:t xml:space="preserve"> (</w:t>
+      </w:r>
+      <w:proofErr w:type="spellStart"/>
+      <w:r>
+        <w:rPr>
+          <w:rFonts w:ascii="Times New Roman" w:eastAsia="Times New Roman" w:hAnsi="Times New Roman" w:cs="Times New Roman"/>
+          <w:sz w:val="24"/>
+          <w:szCs w:val="24"/>
+          <w:lang w:val="es-CO"/>
+        </w:rPr>
+        <w:t>Colaboratory</w:t>
+      </w:r>
+      <w:proofErr w:type="spellEnd"/>
+      <w:r>
+        <w:rPr>
+          <w:rFonts w:ascii="Times New Roman" w:eastAsia="Times New Roman" w:hAnsi="Times New Roman" w:cs="Times New Roman"/>
+          <w:sz w:val="24"/>
+          <w:szCs w:val="24"/>
+          <w:lang w:val="es-CO"/>
+        </w:rPr>
+        <w:t xml:space="preserve">). Esta aplicación en línea permite ejecutar código </w:t>
+      </w:r>
+      <w:proofErr w:type="spellStart"/>
+      <w:r>
+        <w:rPr>
+          <w:rFonts w:ascii="Times New Roman" w:eastAsia="Times New Roman" w:hAnsi="Times New Roman" w:cs="Times New Roman"/>
+          <w:sz w:val="24"/>
+          <w:szCs w:val="24"/>
+          <w:lang w:val="es-CO"/>
+        </w:rPr>
+        <w:t>python</w:t>
+      </w:r>
+      <w:proofErr w:type="spellEnd"/>
+      <w:r>
+        <w:rPr>
+          <w:rFonts w:ascii="Times New Roman" w:eastAsia="Times New Roman" w:hAnsi="Times New Roman" w:cs="Times New Roman"/>
+          <w:sz w:val="24"/>
+          <w:szCs w:val="24"/>
+          <w:lang w:val="es-CO"/>
+        </w:rPr>
+        <w:t xml:space="preserve"> en computadores en línea y de manera gratuita son tener que descargar ningún software. </w:t>
+      </w:r>
+    </w:p>
+    <w:p>
+      <w:pPr>
+        <w:spacing w:before="100" w:beforeAutospacing="1" w:after="100" w:afterAutospacing="1" w:line="240" w:lineRule="auto"/>
+        <w:rPr>
+          <w:rFonts w:ascii="Times New Roman" w:eastAsia="Times New Roman" w:hAnsi="Times New Roman" w:cs="Times New Roman"/>
+          <w:sz w:val="24"/>
+          <w:szCs w:val="24"/>
+          <w:lang w:val="es-CO"/>
+        </w:rPr>
+      </w:pPr>
+    </w:p>
+    <w:p>
+      <w:pPr>
+        <w:spacing w:before="100" w:beforeAutospacing="1" w:after="100" w:afterAutospacing="1" w:line="240" w:lineRule="auto"/>
+        <w:rPr>
+          <w:rFonts w:ascii="Times New Roman" w:eastAsia="Times New Roman" w:hAnsi="Times New Roman" w:cs="Times New Roman"/>
+          <w:sz w:val="24"/>
+          <w:szCs w:val="24"/>
+          <w:lang w:val="es-CO"/>
+        </w:rPr>
+      </w:pPr>
+    </w:p>
+    <w:p>
+      <w:pPr>
+        <w:spacing w:before="100" w:beforeAutospacing="1" w:after="100" w:afterAutospacing="1" w:line="240" w:lineRule="auto"/>
+        <w:rPr>
+          <w:rFonts w:ascii="Times New Roman" w:eastAsia="Times New Roman" w:hAnsi="Times New Roman" w:cs="Times New Roman"/>
+          <w:sz w:val="24"/>
+          <w:szCs w:val="24"/>
+          <w:lang w:val="es-CO"/>
+        </w:rPr>
+      </w:pPr>
+      <w:r>
+        <w:rPr>
+          <w:rFonts w:ascii="Times New Roman" w:eastAsia="Times New Roman" w:hAnsi="Times New Roman" w:cs="Times New Roman"/>
+          <w:sz w:val="24"/>
+          <w:szCs w:val="24"/>
+          <w:lang w:val="es-CO"/>
+        </w:rPr>
+        <w:lastRenderedPageBreak/>
         <w:t xml:space="preserve">Virtualizar el curso de machine </w:t>
       </w:r>
       <w:proofErr w:type="spellStart"/>
@@ -783,47 +843,271 @@
           <w:szCs w:val="24"/>
           <w:lang w:val="es-CO"/>
         </w:rPr>
-        <w:t xml:space="preserve"> permite a las personas acceder </w:t>
-      </w:r>
-      <w:r>
-        <w:rPr>
-          <w:rFonts w:ascii="Times New Roman" w:eastAsia="Times New Roman" w:hAnsi="Times New Roman" w:cs="Times New Roman"/>
-          <w:sz w:val="24"/>
-          <w:szCs w:val="24"/>
-          <w:lang w:val="es-CO"/>
-        </w:rPr>
-        <w:t>a cualquier hora del día a su proceso de formación en ciencia de datos y requiere de un componente inicial muy práctico para la adquisición de metodología de análisis de datos y de codificación en lenguaje Python para esta actividad.</w:t>
-      </w:r>
-    </w:p>
-    <w:p>
-      <w:pPr>
-        <w:spacing w:before="100" w:beforeAutospacing="1" w:after="100" w:afterAutospacing="1" w:line="240" w:lineRule="auto"/>
-        <w:rPr>
-          <w:rFonts w:ascii="Times New Roman" w:eastAsia="Times New Roman" w:hAnsi="Times New Roman" w:cs="Times New Roman"/>
-          <w:sz w:val="24"/>
-          <w:szCs w:val="24"/>
-          <w:lang w:val="es-CO"/>
-        </w:rPr>
-      </w:pPr>
-    </w:p>
-    <w:p>
-      <w:pPr>
-        <w:spacing w:before="100" w:beforeAutospacing="1" w:after="100" w:afterAutospacing="1" w:line="240" w:lineRule="auto"/>
-        <w:rPr>
-          <w:rFonts w:ascii="Times New Roman" w:eastAsia="Times New Roman" w:hAnsi="Times New Roman" w:cs="Times New Roman"/>
-          <w:sz w:val="24"/>
-          <w:szCs w:val="24"/>
-          <w:lang w:val="es-CO"/>
-        </w:rPr>
-      </w:pPr>
-      <w:r>
-        <w:rPr>
-          <w:rFonts w:ascii="Times New Roman" w:eastAsia="Times New Roman" w:hAnsi="Times New Roman" w:cs="Times New Roman"/>
-          <w:sz w:val="24"/>
-          <w:szCs w:val="24"/>
-          <w:lang w:val="es-CO"/>
-        </w:rPr>
-        <w:lastRenderedPageBreak/>
+        <w:t xml:space="preserve"> permite</w:t>
+      </w:r>
+      <w:r>
+        <w:rPr>
+          <w:rFonts w:ascii="Times New Roman" w:eastAsia="Times New Roman" w:hAnsi="Times New Roman" w:cs="Times New Roman"/>
+          <w:sz w:val="24"/>
+          <w:szCs w:val="24"/>
+          <w:lang w:val="es-CO"/>
+        </w:rPr>
+        <w:t>:</w:t>
+      </w:r>
+    </w:p>
+    <w:p>
+      <w:pPr>
+        <w:spacing w:before="100" w:beforeAutospacing="1" w:after="100" w:afterAutospacing="1" w:line="240" w:lineRule="auto"/>
+        <w:rPr>
+          <w:rFonts w:ascii="Times New Roman" w:eastAsia="Times New Roman" w:hAnsi="Times New Roman" w:cs="Times New Roman"/>
+          <w:sz w:val="24"/>
+          <w:szCs w:val="24"/>
+          <w:lang w:val="es-CO"/>
+        </w:rPr>
+      </w:pPr>
+      <w:r>
+        <w:rPr>
+          <w:rFonts w:ascii="Times New Roman" w:eastAsia="Times New Roman" w:hAnsi="Times New Roman" w:cs="Times New Roman"/>
+          <w:b/>
+          <w:bCs/>
+          <w:sz w:val="24"/>
+          <w:szCs w:val="24"/>
+          <w:lang w:val="es-CO"/>
+        </w:rPr>
+        <w:t>Libre acceso</w:t>
+      </w:r>
+      <w:r>
+        <w:rPr>
+          <w:rFonts w:ascii="Times New Roman" w:eastAsia="Times New Roman" w:hAnsi="Times New Roman" w:cs="Times New Roman"/>
+          <w:b/>
+          <w:bCs/>
+          <w:sz w:val="24"/>
+          <w:szCs w:val="24"/>
+          <w:lang w:val="es-CO"/>
+        </w:rPr>
+        <w:t xml:space="preserve"> </w:t>
+      </w:r>
+      <w:r>
+        <w:rPr>
+          <w:rFonts w:ascii="Times New Roman" w:eastAsia="Times New Roman" w:hAnsi="Times New Roman" w:cs="Times New Roman"/>
+          <w:b/>
+          <w:bCs/>
+          <w:sz w:val="24"/>
+          <w:szCs w:val="24"/>
+          <w:lang w:val="es-CO"/>
+        </w:rPr>
+        <w:t>a cualquier hora del día</w:t>
+      </w:r>
+      <w:r>
+        <w:rPr>
+          <w:rFonts w:ascii="Times New Roman" w:eastAsia="Times New Roman" w:hAnsi="Times New Roman" w:cs="Times New Roman"/>
+          <w:sz w:val="24"/>
+          <w:szCs w:val="24"/>
+          <w:lang w:val="es-CO"/>
+        </w:rPr>
+        <w:t xml:space="preserve"> a su proceso de formación en ciencia de datos </w:t>
+      </w:r>
+      <w:r>
+        <w:rPr>
+          <w:rFonts w:ascii="Times New Roman" w:eastAsia="Times New Roman" w:hAnsi="Times New Roman" w:cs="Times New Roman"/>
+          <w:sz w:val="24"/>
+          <w:szCs w:val="24"/>
+          <w:lang w:val="es-CO"/>
+        </w:rPr>
+        <w:t>que</w:t>
+      </w:r>
+      <w:r>
+        <w:rPr>
+          <w:rFonts w:ascii="Times New Roman" w:eastAsia="Times New Roman" w:hAnsi="Times New Roman" w:cs="Times New Roman"/>
+          <w:sz w:val="24"/>
+          <w:szCs w:val="24"/>
+          <w:lang w:val="es-CO"/>
+        </w:rPr>
+        <w:t xml:space="preserve"> requiere de un componente </w:t>
+      </w:r>
+      <w:proofErr w:type="gramStart"/>
+      <w:r>
+        <w:rPr>
+          <w:rFonts w:ascii="Times New Roman" w:eastAsia="Times New Roman" w:hAnsi="Times New Roman" w:cs="Times New Roman"/>
+          <w:sz w:val="24"/>
+          <w:szCs w:val="24"/>
+          <w:lang w:val="es-CO"/>
+        </w:rPr>
+        <w:t>práctico</w:t>
+      </w:r>
+      <w:r>
+        <w:rPr>
+          <w:rFonts w:ascii="Times New Roman" w:eastAsia="Times New Roman" w:hAnsi="Times New Roman" w:cs="Times New Roman"/>
+          <w:sz w:val="24"/>
+          <w:szCs w:val="24"/>
+          <w:lang w:val="es-CO"/>
+        </w:rPr>
+        <w:t xml:space="preserve"> </w:t>
+      </w:r>
+      <w:r>
+        <w:rPr>
+          <w:rFonts w:ascii="Times New Roman" w:eastAsia="Times New Roman" w:hAnsi="Times New Roman" w:cs="Times New Roman"/>
+          <w:sz w:val="24"/>
+          <w:szCs w:val="24"/>
+          <w:lang w:val="es-CO"/>
+        </w:rPr>
+        <w:t xml:space="preserve"> para</w:t>
+      </w:r>
+      <w:proofErr w:type="gramEnd"/>
+      <w:r>
+        <w:rPr>
+          <w:rFonts w:ascii="Times New Roman" w:eastAsia="Times New Roman" w:hAnsi="Times New Roman" w:cs="Times New Roman"/>
+          <w:sz w:val="24"/>
+          <w:szCs w:val="24"/>
+          <w:lang w:val="es-CO"/>
+        </w:rPr>
+        <w:t xml:space="preserve"> la adquisición de</w:t>
+      </w:r>
+      <w:r>
+        <w:rPr>
+          <w:rFonts w:ascii="Times New Roman" w:eastAsia="Times New Roman" w:hAnsi="Times New Roman" w:cs="Times New Roman"/>
+          <w:sz w:val="24"/>
+          <w:szCs w:val="24"/>
+          <w:lang w:val="es-CO"/>
+        </w:rPr>
+        <w:t xml:space="preserve"> las</w:t>
+      </w:r>
+      <w:r>
+        <w:rPr>
+          <w:rFonts w:ascii="Times New Roman" w:eastAsia="Times New Roman" w:hAnsi="Times New Roman" w:cs="Times New Roman"/>
+          <w:sz w:val="24"/>
+          <w:szCs w:val="24"/>
+          <w:lang w:val="es-CO"/>
+        </w:rPr>
+        <w:t xml:space="preserve"> metodología</w:t>
+      </w:r>
+      <w:r>
+        <w:rPr>
+          <w:rFonts w:ascii="Times New Roman" w:eastAsia="Times New Roman" w:hAnsi="Times New Roman" w:cs="Times New Roman"/>
+          <w:sz w:val="24"/>
+          <w:szCs w:val="24"/>
+          <w:lang w:val="es-CO"/>
+        </w:rPr>
+        <w:t>s</w:t>
+      </w:r>
+      <w:r>
+        <w:rPr>
+          <w:rFonts w:ascii="Times New Roman" w:eastAsia="Times New Roman" w:hAnsi="Times New Roman" w:cs="Times New Roman"/>
+          <w:sz w:val="24"/>
+          <w:szCs w:val="24"/>
+          <w:lang w:val="es-CO"/>
+        </w:rPr>
+        <w:t xml:space="preserve"> de análisis de datos y de codificación en lenguaje Python para esta actividad.</w:t>
+      </w:r>
+    </w:p>
+    <w:p>
+      <w:pPr>
+        <w:spacing w:before="100" w:beforeAutospacing="1" w:after="100" w:afterAutospacing="1" w:line="240" w:lineRule="auto"/>
+        <w:rPr>
+          <w:rFonts w:ascii="Times New Roman" w:eastAsia="Times New Roman" w:hAnsi="Times New Roman" w:cs="Times New Roman"/>
+          <w:sz w:val="24"/>
+          <w:szCs w:val="24"/>
+          <w:lang w:val="es-CO"/>
+        </w:rPr>
+      </w:pPr>
+      <w:r>
+        <w:rPr>
+          <w:rFonts w:ascii="Times New Roman" w:eastAsia="Times New Roman" w:hAnsi="Times New Roman" w:cs="Times New Roman"/>
+          <w:b/>
+          <w:bCs/>
+          <w:sz w:val="24"/>
+          <w:szCs w:val="24"/>
+          <w:lang w:val="es-CO"/>
+        </w:rPr>
+        <w:t>Mayor t</w:t>
+      </w:r>
+      <w:r>
+        <w:rPr>
+          <w:rFonts w:ascii="Times New Roman" w:eastAsia="Times New Roman" w:hAnsi="Times New Roman" w:cs="Times New Roman"/>
+          <w:b/>
+          <w:bCs/>
+          <w:sz w:val="24"/>
+          <w:szCs w:val="24"/>
+          <w:lang w:val="es-CO"/>
+        </w:rPr>
+        <w:t>iempo de practica para adquisición de habilidades de codificación</w:t>
+      </w:r>
+      <w:r>
+        <w:rPr>
+          <w:rFonts w:ascii="Times New Roman" w:eastAsia="Times New Roman" w:hAnsi="Times New Roman" w:cs="Times New Roman"/>
+          <w:sz w:val="24"/>
+          <w:szCs w:val="24"/>
+          <w:lang w:val="es-CO"/>
+        </w:rPr>
+        <w:t xml:space="preserve"> en lenguaje Python </w:t>
+      </w:r>
+      <w:r>
+        <w:rPr>
+          <w:rFonts w:ascii="Times New Roman" w:eastAsia="Times New Roman" w:hAnsi="Times New Roman" w:cs="Times New Roman"/>
+          <w:sz w:val="24"/>
+          <w:szCs w:val="24"/>
+          <w:lang w:val="es-CO"/>
+        </w:rPr>
+        <w:t xml:space="preserve">asistida por video asociados a cuadernos </w:t>
+      </w:r>
+      <w:proofErr w:type="spellStart"/>
+      <w:r>
+        <w:rPr>
+          <w:rFonts w:ascii="Times New Roman" w:eastAsia="Times New Roman" w:hAnsi="Times New Roman" w:cs="Times New Roman"/>
+          <w:sz w:val="24"/>
+          <w:szCs w:val="24"/>
+          <w:lang w:val="es-CO"/>
+        </w:rPr>
+        <w:t>Jupyter</w:t>
+      </w:r>
+      <w:proofErr w:type="spellEnd"/>
+      <w:r>
+        <w:rPr>
+          <w:rFonts w:ascii="Times New Roman" w:eastAsia="Times New Roman" w:hAnsi="Times New Roman" w:cs="Times New Roman"/>
+          <w:sz w:val="24"/>
+          <w:szCs w:val="24"/>
+          <w:lang w:val="es-CO"/>
+        </w:rPr>
+        <w:t xml:space="preserve"> que asisten y orientan al estudiante a cualquier hora del día en su práctica individual para la adquisición de habilidades de codificación en lenguaje Python y de interiorización de las metodologías propias del machine </w:t>
+      </w:r>
+      <w:proofErr w:type="spellStart"/>
+      <w:r>
+        <w:rPr>
+          <w:rFonts w:ascii="Times New Roman" w:eastAsia="Times New Roman" w:hAnsi="Times New Roman" w:cs="Times New Roman"/>
+          <w:sz w:val="24"/>
+          <w:szCs w:val="24"/>
+          <w:lang w:val="es-CO"/>
+        </w:rPr>
+        <w:t>Leaning</w:t>
+      </w:r>
+      <w:proofErr w:type="spellEnd"/>
+      <w:r>
+        <w:rPr>
+          <w:rFonts w:ascii="Times New Roman" w:eastAsia="Times New Roman" w:hAnsi="Times New Roman" w:cs="Times New Roman"/>
+          <w:sz w:val="24"/>
+          <w:szCs w:val="24"/>
+          <w:lang w:val="es-CO"/>
+        </w:rPr>
+        <w:t xml:space="preserve"> como la de dividir de manera aleatoria a los datos en un subconjunto de entrenamiento y otro de testeo o prueba. </w:t>
+      </w:r>
+    </w:p>
+    <w:p>
+      <w:pPr>
+        <w:spacing w:before="100" w:beforeAutospacing="1" w:after="100" w:afterAutospacing="1" w:line="240" w:lineRule="auto"/>
+        <w:rPr>
+          <w:rFonts w:ascii="Times New Roman" w:eastAsia="Times New Roman" w:hAnsi="Times New Roman" w:cs="Times New Roman"/>
+          <w:sz w:val="24"/>
+          <w:szCs w:val="24"/>
+          <w:lang w:val="es-CO"/>
+        </w:rPr>
+      </w:pPr>
+      <w:r>
+        <w:rPr>
+          <w:rFonts w:ascii="Times New Roman" w:eastAsia="Times New Roman" w:hAnsi="Times New Roman" w:cs="Times New Roman"/>
+          <w:sz w:val="24"/>
+          <w:szCs w:val="24"/>
+          <w:lang w:val="es-CO"/>
+        </w:rPr>
         <w:t xml:space="preserve">Y en la actualidad, </w:t>
       </w:r>
       <w:r>
@@ -871,7 +1155,7 @@
           <w:szCs w:val="24"/>
           <w:lang w:val="es-CO"/>
         </w:rPr>
-        <w:t xml:space="preserve"> a través del lenguaje gratuito que es Python, </w:t>
+        <w:t xml:space="preserve"> a través del lenguaje gratuito Python, </w:t>
       </w:r>
       <w:r>
         <w:rPr>
@@ -881,6 +1165,81 @@
           <w:lang w:val="es-CO"/>
         </w:rPr>
         <w:t xml:space="preserve">se ha vuelto de gran necesidad diaria en múltiples campos del saber y de la vida cotidiana. </w:t>
+      </w:r>
+    </w:p>
+    <w:p>
+      <w:pPr>
+        <w:spacing w:before="100" w:beforeAutospacing="1" w:after="100" w:afterAutospacing="1" w:line="240" w:lineRule="auto"/>
+        <w:rPr>
+          <w:rFonts w:ascii="Times New Roman" w:eastAsia="Times New Roman" w:hAnsi="Times New Roman" w:cs="Times New Roman"/>
+          <w:sz w:val="24"/>
+          <w:szCs w:val="24"/>
+          <w:lang w:val="es-CO"/>
+        </w:rPr>
+      </w:pPr>
+    </w:p>
+    <w:p>
+      <w:pPr>
+        <w:spacing w:before="100" w:beforeAutospacing="1" w:after="100" w:afterAutospacing="1" w:line="240" w:lineRule="auto"/>
+        <w:rPr>
+          <w:rFonts w:ascii="Times New Roman" w:eastAsia="Times New Roman" w:hAnsi="Times New Roman" w:cs="Times New Roman"/>
+          <w:sz w:val="24"/>
+          <w:szCs w:val="24"/>
+          <w:lang w:val="es-CO"/>
+        </w:rPr>
+      </w:pPr>
+      <w:r>
+        <w:rPr>
+          <w:noProof/>
+        </w:rPr>
+        <w:drawing>
+          <wp:inline distT="0" distB="0" distL="0" distR="0" wp14:anchorId="0F2F3D7A" wp14:editId="17779B56">
+            <wp:extent cx="5612130" cy="4871720"/>
+            <wp:effectExtent l="0" t="0" r="7620" b="5080"/>
+            <wp:docPr id="1" name="Picture 1"/>
+            <wp:cNvGraphicFramePr>
+              <a:graphicFrameLocks xmlns:a="http://schemas.openxmlformats.org/drawingml/2006/main" noChangeAspect="1"/>
+            </wp:cNvGraphicFramePr>
+            <a:graphic xmlns:a="http://schemas.openxmlformats.org/drawingml/2006/main">
+              <a:graphicData uri="http://schemas.openxmlformats.org/drawingml/2006/picture">
+                <pic:pic xmlns:pic="http://schemas.openxmlformats.org/drawingml/2006/picture">
+                  <pic:nvPicPr>
+                    <pic:cNvPr id="0" name="Picture 1"/>
+                    <pic:cNvPicPr>
+                      <a:picLocks noChangeAspect="1" noChangeArrowheads="1"/>
+                    </pic:cNvPicPr>
+                  </pic:nvPicPr>
+                  <pic:blipFill>
+                    <a:blip r:embed="rId5">
+                      <a:extLst>
+                        <a:ext uri="{28A0092B-C50C-407E-A947-70E740481C1C}">
+                          <a14:useLocalDpi xmlns:a14="http://schemas.microsoft.com/office/drawing/2010/main" val="0"/>
+                        </a:ext>
+                      </a:extLst>
+                    </a:blip>
+                    <a:srcRect/>
+                    <a:stretch>
+                      <a:fillRect/>
+                    </a:stretch>
+                  </pic:blipFill>
+                  <pic:spPr bwMode="auto">
+                    <a:xfrm>
+                      <a:off x="0" y="0"/>
+                      <a:ext cx="5612130" cy="4871720"/>
+                    </a:xfrm>
+                    <a:prstGeom prst="rect">
+                      <a:avLst/>
+                    </a:prstGeom>
+                    <a:noFill/>
+                    <a:ln>
+                      <a:noFill/>
+                    </a:ln>
+                  </pic:spPr>
+                </pic:pic>
+              </a:graphicData>
+            </a:graphic>
+          </wp:inline>
+        </w:drawing>
       </w:r>
     </w:p>
     <w:p>
@@ -1093,52 +1452,7 @@
           <w:szCs w:val="24"/>
           <w:lang w:val="es-CO"/>
         </w:rPr>
-        <w:t xml:space="preserve">Estudiantes de pregrado de la </w:t>
-      </w:r>
-      <w:r>
-        <w:rPr>
-          <w:rFonts w:ascii="Times New Roman" w:eastAsia="Times New Roman" w:hAnsi="Times New Roman" w:cs="Times New Roman"/>
-          <w:sz w:val="24"/>
-          <w:szCs w:val="24"/>
-          <w:lang w:val="es-CO"/>
-        </w:rPr>
-        <w:t>Universidad de Antioquia</w:t>
-      </w:r>
-      <w:r>
-        <w:rPr>
-          <w:rFonts w:ascii="Times New Roman" w:eastAsia="Times New Roman" w:hAnsi="Times New Roman" w:cs="Times New Roman"/>
-          <w:sz w:val="24"/>
-          <w:szCs w:val="24"/>
-          <w:lang w:val="es-CO"/>
-        </w:rPr>
-        <w:t xml:space="preserve"> y </w:t>
-      </w:r>
-      <w:r>
-        <w:rPr>
-          <w:rFonts w:ascii="Times New Roman" w:eastAsia="Times New Roman" w:hAnsi="Times New Roman" w:cs="Times New Roman"/>
-          <w:sz w:val="24"/>
-          <w:szCs w:val="24"/>
-          <w:lang w:val="es-CO"/>
-        </w:rPr>
-        <w:t>público</w:t>
-      </w:r>
-      <w:r>
-        <w:rPr>
-          <w:rFonts w:ascii="Times New Roman" w:eastAsia="Times New Roman" w:hAnsi="Times New Roman" w:cs="Times New Roman"/>
-          <w:sz w:val="24"/>
-          <w:szCs w:val="24"/>
-          <w:lang w:val="es-CO"/>
-        </w:rPr>
-        <w:t xml:space="preserve"> en general del sector privado interesado en </w:t>
-      </w:r>
-      <w:r>
-        <w:rPr>
-          <w:rFonts w:ascii="Times New Roman" w:eastAsia="Times New Roman" w:hAnsi="Times New Roman" w:cs="Times New Roman"/>
-          <w:sz w:val="24"/>
-          <w:szCs w:val="24"/>
-          <w:lang w:val="es-CO"/>
-        </w:rPr>
-        <w:t xml:space="preserve">aprender técnicas de machine </w:t>
+        <w:t xml:space="preserve">Estudiantes de pregrado de la Universidad de Antioquia y público en general de Colombia y el mundo, del sector privado interesado en aprender técnicas de machine </w:t>
       </w:r>
       <w:proofErr w:type="spellStart"/>
       <w:r>
@@ -1158,43 +1472,7 @@
           <w:szCs w:val="24"/>
           <w:lang w:val="es-CO"/>
         </w:rPr>
-        <w:t xml:space="preserve"> </w:t>
-      </w:r>
-      <w:r>
-        <w:rPr>
-          <w:rFonts w:ascii="Times New Roman" w:eastAsia="Times New Roman" w:hAnsi="Times New Roman" w:cs="Times New Roman"/>
-          <w:sz w:val="24"/>
-          <w:szCs w:val="24"/>
-          <w:lang w:val="es-CO"/>
-        </w:rPr>
-        <w:t>con Python</w:t>
-      </w:r>
-      <w:r>
-        <w:rPr>
-          <w:rFonts w:ascii="Times New Roman" w:eastAsia="Times New Roman" w:hAnsi="Times New Roman" w:cs="Times New Roman"/>
-          <w:sz w:val="24"/>
-          <w:szCs w:val="24"/>
-          <w:lang w:val="es-CO"/>
-        </w:rPr>
-        <w:t xml:space="preserve"> para </w:t>
-      </w:r>
-      <w:r>
-        <w:rPr>
-          <w:rFonts w:ascii="Times New Roman" w:eastAsia="Times New Roman" w:hAnsi="Times New Roman" w:cs="Times New Roman"/>
-          <w:sz w:val="24"/>
-          <w:szCs w:val="24"/>
-          <w:lang w:val="es-CO"/>
-        </w:rPr>
-        <w:t>convertirse en científicos de datos</w:t>
-      </w:r>
-      <w:r>
-        <w:rPr>
-          <w:rFonts w:ascii="Times New Roman" w:eastAsia="Times New Roman" w:hAnsi="Times New Roman" w:cs="Times New Roman"/>
-          <w:sz w:val="24"/>
-          <w:szCs w:val="24"/>
-          <w:lang w:val="es-CO"/>
-        </w:rPr>
-        <w:t xml:space="preserve">. </w:t>
+        <w:t xml:space="preserve"> y de ciencia de datos con Python para convertirse en científicos de datos.</w:t>
       </w:r>
     </w:p>
     <w:p>
@@ -1206,14 +1484,18 @@
         <w:spacing w:before="100" w:beforeAutospacing="1" w:after="100" w:afterAutospacing="1" w:line="240" w:lineRule="auto"/>
         <w:rPr>
           <w:rFonts w:ascii="Times New Roman" w:eastAsia="Times New Roman" w:hAnsi="Times New Roman" w:cs="Times New Roman"/>
-          <w:sz w:val="24"/>
-          <w:szCs w:val="24"/>
-          <w:lang w:val="es-CO"/>
-        </w:rPr>
-      </w:pPr>
-      <w:r>
-        <w:rPr>
-          <w:rFonts w:ascii="Times New Roman" w:eastAsia="Times New Roman" w:hAnsi="Times New Roman" w:cs="Times New Roman"/>
+          <w:b/>
+          <w:bCs/>
+          <w:sz w:val="24"/>
+          <w:szCs w:val="24"/>
+          <w:lang w:val="es-CO"/>
+        </w:rPr>
+      </w:pPr>
+      <w:r>
+        <w:rPr>
+          <w:rFonts w:ascii="Times New Roman" w:eastAsia="Times New Roman" w:hAnsi="Times New Roman" w:cs="Times New Roman"/>
+          <w:b/>
+          <w:bCs/>
           <w:sz w:val="24"/>
           <w:szCs w:val="24"/>
           <w:lang w:val="es-CO"/>
@@ -1261,44 +1543,129 @@
           <w:szCs w:val="24"/>
           <w:lang w:val="es-CO"/>
         </w:rPr>
-        <w:t xml:space="preserve">: tipos de datos en Python, estructuras de datos en Python, </w:t>
-      </w:r>
-      <w:r>
-        <w:rPr>
-          <w:rFonts w:ascii="Times New Roman" w:eastAsia="Times New Roman" w:hAnsi="Times New Roman" w:cs="Times New Roman"/>
-          <w:sz w:val="24"/>
-          <w:szCs w:val="24"/>
-          <w:lang w:val="es-CO"/>
-        </w:rPr>
-        <w:t xml:space="preserve">librerías para procesamiento, visualización y </w:t>
-      </w:r>
-      <w:r>
-        <w:rPr>
-          <w:rFonts w:ascii="Times New Roman" w:eastAsia="Times New Roman" w:hAnsi="Times New Roman" w:cs="Times New Roman"/>
-          <w:sz w:val="24"/>
-          <w:szCs w:val="24"/>
-          <w:lang w:val="es-CO"/>
-        </w:rPr>
-        <w:t>m</w:t>
-      </w:r>
-      <w:r>
-        <w:rPr>
-          <w:rFonts w:ascii="Times New Roman" w:eastAsia="Times New Roman" w:hAnsi="Times New Roman" w:cs="Times New Roman"/>
-          <w:sz w:val="24"/>
-          <w:szCs w:val="24"/>
-          <w:lang w:val="es-CO"/>
-        </w:rPr>
-        <w:t>odelamiento</w:t>
-      </w:r>
-      <w:r>
-        <w:rPr>
-          <w:rFonts w:ascii="Times New Roman" w:eastAsia="Times New Roman" w:hAnsi="Times New Roman" w:cs="Times New Roman"/>
-          <w:sz w:val="24"/>
-          <w:szCs w:val="24"/>
-          <w:lang w:val="es-CO"/>
-        </w:rPr>
-        <w:t xml:space="preserve">. </w:t>
-      </w:r>
+        <w:t xml:space="preserve">: </w:t>
+      </w:r>
+    </w:p>
+    <w:p>
+      <w:pPr>
+        <w:pStyle w:val="ListParagraph"/>
+        <w:numPr>
+          <w:ilvl w:val="0"/>
+          <w:numId w:val="5"/>
+        </w:numPr>
+        <w:spacing w:before="100" w:beforeAutospacing="1" w:after="100" w:afterAutospacing="1" w:line="240" w:lineRule="auto"/>
+        <w:rPr>
+          <w:rFonts w:ascii="Times New Roman" w:eastAsia="Times New Roman" w:hAnsi="Times New Roman" w:cs="Times New Roman"/>
+          <w:sz w:val="24"/>
+          <w:szCs w:val="24"/>
+          <w:lang w:val="es-CO"/>
+        </w:rPr>
+      </w:pPr>
+      <w:r>
+        <w:rPr>
+          <w:rFonts w:ascii="Times New Roman" w:eastAsia="Times New Roman" w:hAnsi="Times New Roman" w:cs="Times New Roman"/>
+          <w:sz w:val="24"/>
+          <w:szCs w:val="24"/>
+          <w:lang w:val="es-CO"/>
+        </w:rPr>
+        <w:t xml:space="preserve">tipos de datos en Python, </w:t>
+      </w:r>
+    </w:p>
+    <w:p>
+      <w:pPr>
+        <w:pStyle w:val="ListParagraph"/>
+        <w:numPr>
+          <w:ilvl w:val="0"/>
+          <w:numId w:val="5"/>
+        </w:numPr>
+        <w:spacing w:before="100" w:beforeAutospacing="1" w:after="100" w:afterAutospacing="1" w:line="240" w:lineRule="auto"/>
+        <w:rPr>
+          <w:rFonts w:ascii="Times New Roman" w:eastAsia="Times New Roman" w:hAnsi="Times New Roman" w:cs="Times New Roman"/>
+          <w:sz w:val="24"/>
+          <w:szCs w:val="24"/>
+          <w:lang w:val="es-CO"/>
+        </w:rPr>
+      </w:pPr>
+      <w:r>
+        <w:rPr>
+          <w:rFonts w:ascii="Times New Roman" w:eastAsia="Times New Roman" w:hAnsi="Times New Roman" w:cs="Times New Roman"/>
+          <w:sz w:val="24"/>
+          <w:szCs w:val="24"/>
+          <w:lang w:val="es-CO"/>
+        </w:rPr>
+        <w:t xml:space="preserve">estructuras de datos en Python, </w:t>
+      </w:r>
+    </w:p>
+    <w:p>
+      <w:pPr>
+        <w:pStyle w:val="ListParagraph"/>
+        <w:numPr>
+          <w:ilvl w:val="0"/>
+          <w:numId w:val="5"/>
+        </w:numPr>
+        <w:spacing w:before="100" w:beforeAutospacing="1" w:after="100" w:afterAutospacing="1" w:line="240" w:lineRule="auto"/>
+        <w:rPr>
+          <w:rFonts w:ascii="Times New Roman" w:eastAsia="Times New Roman" w:hAnsi="Times New Roman" w:cs="Times New Roman"/>
+          <w:sz w:val="24"/>
+          <w:szCs w:val="24"/>
+          <w:lang w:val="es-CO"/>
+        </w:rPr>
+      </w:pPr>
+      <w:r>
+        <w:rPr>
+          <w:rFonts w:ascii="Times New Roman" w:eastAsia="Times New Roman" w:hAnsi="Times New Roman" w:cs="Times New Roman"/>
+          <w:sz w:val="24"/>
+          <w:szCs w:val="24"/>
+          <w:lang w:val="es-CO"/>
+        </w:rPr>
+        <w:t>creación de variables</w:t>
+      </w:r>
+      <w:r>
+        <w:rPr>
+          <w:rFonts w:ascii="Times New Roman" w:eastAsia="Times New Roman" w:hAnsi="Times New Roman" w:cs="Times New Roman"/>
+          <w:sz w:val="24"/>
+          <w:szCs w:val="24"/>
+          <w:lang w:val="es-CO"/>
+        </w:rPr>
+        <w:t xml:space="preserve">, </w:t>
+      </w:r>
+    </w:p>
+    <w:p>
+      <w:pPr>
+        <w:pStyle w:val="ListParagraph"/>
+        <w:numPr>
+          <w:ilvl w:val="0"/>
+          <w:numId w:val="5"/>
+        </w:numPr>
+        <w:spacing w:before="100" w:beforeAutospacing="1" w:after="100" w:afterAutospacing="1" w:line="240" w:lineRule="auto"/>
+        <w:rPr>
+          <w:rFonts w:ascii="Times New Roman" w:eastAsia="Times New Roman" w:hAnsi="Times New Roman" w:cs="Times New Roman"/>
+          <w:sz w:val="24"/>
+          <w:szCs w:val="24"/>
+          <w:lang w:val="es-CO"/>
+        </w:rPr>
+      </w:pPr>
+      <w:r>
+        <w:rPr>
+          <w:rFonts w:ascii="Times New Roman" w:eastAsia="Times New Roman" w:hAnsi="Times New Roman" w:cs="Times New Roman"/>
+          <w:sz w:val="24"/>
+          <w:szCs w:val="24"/>
+          <w:lang w:val="es-CO"/>
+        </w:rPr>
+        <w:t>controladores de flujo</w:t>
+      </w:r>
+    </w:p>
+    <w:p>
+      <w:pPr>
+        <w:spacing w:before="100" w:beforeAutospacing="1" w:after="100" w:afterAutospacing="1" w:line="240" w:lineRule="auto"/>
+        <w:ind w:left="1320"/>
+        <w:rPr>
+          <w:rFonts w:ascii="Times New Roman" w:eastAsia="Times New Roman" w:hAnsi="Times New Roman" w:cs="Times New Roman"/>
+          <w:sz w:val="24"/>
+          <w:szCs w:val="24"/>
+          <w:lang w:val="es-CO"/>
+        </w:rPr>
+      </w:pPr>
     </w:p>
     <w:p>
       <w:pPr>
@@ -1347,17 +1714,16 @@
           <w:szCs w:val="24"/>
           <w:lang w:val="es-CO"/>
         </w:rPr>
-        <w:t xml:space="preserve">Estadística descriptiva para ciencia de </w:t>
-      </w:r>
-      <w:proofErr w:type="gramStart"/>
-      <w:r>
-        <w:rPr>
-          <w:rFonts w:ascii="Times New Roman" w:eastAsia="Times New Roman" w:hAnsi="Times New Roman" w:cs="Times New Roman"/>
-          <w:sz w:val="24"/>
-          <w:szCs w:val="24"/>
-          <w:lang w:val="es-CO"/>
-        </w:rPr>
-        <w:t>datos</w:t>
+        <w:t>Estadística descriptiva para ciencia de datos</w:t>
+      </w:r>
+      <w:r>
+        <w:rPr>
+          <w:rFonts w:ascii="Times New Roman" w:eastAsia="Times New Roman" w:hAnsi="Times New Roman" w:cs="Times New Roman"/>
+          <w:sz w:val="24"/>
+          <w:szCs w:val="24"/>
+          <w:lang w:val="es-CO"/>
+        </w:rPr>
+        <w:t xml:space="preserve"> </w:t>
       </w:r>
       <w:r>
         <w:rPr>
@@ -1369,7 +1735,6 @@
         <w:t>(</w:t>
       </w:r>
       <w:proofErr w:type="spellStart"/>
-      <w:proofErr w:type="gramEnd"/>
       <w:r>
         <w:rPr>
           <w:rFonts w:ascii="Times New Roman" w:eastAsia="Times New Roman" w:hAnsi="Times New Roman" w:cs="Times New Roman"/>
@@ -1452,7 +1817,25 @@
           <w:szCs w:val="24"/>
           <w:lang w:val="es-CO"/>
         </w:rPr>
-        <w:t>Estadística inferencial para ciencia de datos.</w:t>
+        <w:t>Estadística inferencial para ciencia de datos</w:t>
+      </w:r>
+      <w:r>
+        <w:rPr>
+          <w:rFonts w:ascii="Times New Roman" w:eastAsia="Times New Roman" w:hAnsi="Times New Roman" w:cs="Times New Roman"/>
+          <w:sz w:val="24"/>
+          <w:szCs w:val="24"/>
+          <w:lang w:val="es-CO"/>
+        </w:rPr>
+        <w:t xml:space="preserve"> (Distribución normal, uniforme y correlación de Pearson)</w:t>
+      </w:r>
+      <w:r>
+        <w:rPr>
+          <w:rFonts w:ascii="Times New Roman" w:eastAsia="Times New Roman" w:hAnsi="Times New Roman" w:cs="Times New Roman"/>
+          <w:sz w:val="24"/>
+          <w:szCs w:val="24"/>
+          <w:lang w:val="es-CO"/>
+        </w:rPr>
+        <w:t>.</w:t>
       </w:r>
     </w:p>
     <w:p>
@@ -1647,6 +2030,26 @@
           <w:szCs w:val="24"/>
           <w:lang w:val="es-CO"/>
         </w:rPr>
+        <w:t xml:space="preserve"> también con </w:t>
+      </w:r>
+      <w:proofErr w:type="spellStart"/>
+      <w:r>
+        <w:rPr>
+          <w:rFonts w:ascii="Times New Roman" w:eastAsia="Times New Roman" w:hAnsi="Times New Roman" w:cs="Times New Roman"/>
+          <w:sz w:val="24"/>
+          <w:szCs w:val="24"/>
+          <w:lang w:val="es-CO"/>
+        </w:rPr>
+        <w:t>Scikitlearn</w:t>
+      </w:r>
+      <w:proofErr w:type="spellEnd"/>
+      <w:r>
+        <w:rPr>
+          <w:rFonts w:ascii="Times New Roman" w:eastAsia="Times New Roman" w:hAnsi="Times New Roman" w:cs="Times New Roman"/>
+          <w:sz w:val="24"/>
+          <w:szCs w:val="24"/>
+          <w:lang w:val="es-CO"/>
+        </w:rPr>
         <w:t>.</w:t>
       </w:r>
     </w:p>
@@ -1672,51 +2075,49 @@
           <w:szCs w:val="24"/>
           <w:lang w:val="es-CO"/>
         </w:rPr>
-        <w:t>Constitución de modelos de regresión.</w:t>
-      </w:r>
-    </w:p>
-    <w:p>
-      <w:pPr>
-        <w:pStyle w:val="ListParagraph"/>
-        <w:numPr>
-          <w:ilvl w:val="0"/>
-          <w:numId w:val="2"/>
-        </w:numPr>
+        <w:t>Constitución de modelos de regresión</w:t>
+      </w:r>
+      <w:r>
+        <w:rPr>
+          <w:rFonts w:ascii="Times New Roman" w:eastAsia="Times New Roman" w:hAnsi="Times New Roman" w:cs="Times New Roman"/>
+          <w:sz w:val="24"/>
+          <w:szCs w:val="24"/>
+          <w:lang w:val="es-CO"/>
+        </w:rPr>
+        <w:t xml:space="preserve"> con </w:t>
+      </w:r>
+      <w:proofErr w:type="spellStart"/>
+      <w:r>
+        <w:rPr>
+          <w:rFonts w:ascii="Times New Roman" w:eastAsia="Times New Roman" w:hAnsi="Times New Roman" w:cs="Times New Roman"/>
+          <w:sz w:val="24"/>
+          <w:szCs w:val="24"/>
+          <w:lang w:val="es-CO"/>
+        </w:rPr>
+        <w:t>Sklearn</w:t>
+      </w:r>
+      <w:proofErr w:type="spellEnd"/>
+      <w:r>
+        <w:rPr>
+          <w:rFonts w:ascii="Times New Roman" w:eastAsia="Times New Roman" w:hAnsi="Times New Roman" w:cs="Times New Roman"/>
+          <w:sz w:val="24"/>
+          <w:szCs w:val="24"/>
+          <w:lang w:val="es-CO"/>
+        </w:rPr>
+        <w:t>.</w:t>
+      </w:r>
+    </w:p>
+    <w:p>
+      <w:pPr>
         <w:spacing w:beforeAutospacing="1" w:afterAutospacing="1" w:line="240" w:lineRule="auto"/>
-        <w:rPr>
-          <w:rFonts w:ascii="Times New Roman" w:eastAsia="Times New Roman" w:hAnsi="Times New Roman" w:cs="Times New Roman"/>
-          <w:sz w:val="24"/>
-          <w:szCs w:val="24"/>
-          <w:lang w:val="es-CO"/>
-        </w:rPr>
-      </w:pPr>
-      <w:r>
-        <w:rPr>
-          <w:rFonts w:ascii="Times New Roman" w:eastAsia="Times New Roman" w:hAnsi="Times New Roman" w:cs="Times New Roman"/>
-          <w:sz w:val="24"/>
-          <w:szCs w:val="24"/>
-          <w:lang w:val="es-CO"/>
-        </w:rPr>
-        <w:t>Redes neuronales secuenciales</w:t>
-      </w:r>
-      <w:r>
-        <w:rPr>
-          <w:rFonts w:ascii="Times New Roman" w:eastAsia="Times New Roman" w:hAnsi="Times New Roman" w:cs="Times New Roman"/>
-          <w:sz w:val="24"/>
-          <w:szCs w:val="24"/>
-          <w:lang w:val="es-CO"/>
-        </w:rPr>
-        <w:t xml:space="preserve"> para constituir modelos de regresión y clasificación</w:t>
-      </w:r>
-      <w:r>
-        <w:rPr>
-          <w:rFonts w:ascii="Times New Roman" w:eastAsia="Times New Roman" w:hAnsi="Times New Roman" w:cs="Times New Roman"/>
-          <w:sz w:val="24"/>
-          <w:szCs w:val="24"/>
-          <w:lang w:val="es-CO"/>
-        </w:rPr>
-        <w:t xml:space="preserve">. </w:t>
-      </w:r>
+        <w:ind w:left="360"/>
+        <w:rPr>
+          <w:rFonts w:ascii="Times New Roman" w:eastAsia="Times New Roman" w:hAnsi="Times New Roman" w:cs="Times New Roman"/>
+          <w:sz w:val="24"/>
+          <w:szCs w:val="24"/>
+          <w:lang w:val="es-CO"/>
+        </w:rPr>
+      </w:pPr>
     </w:p>
     <w:p>
       <w:pPr>
@@ -1774,6 +2175,7 @@
           <w:szCs w:val="24"/>
           <w:lang w:val="es-CO"/>
         </w:rPr>
+        <w:lastRenderedPageBreak/>
         <w:t xml:space="preserve">El modelo de enseñanza en este curso </w:t>
       </w:r>
       <w:r>
@@ -1792,7 +2194,65 @@
           <w:szCs w:val="24"/>
           <w:lang w:val="es-CO"/>
         </w:rPr>
-        <w:t xml:space="preserve">el de aula invertida en el que los contenidos y procedimientos los puede leer y adquirir </w:t>
+        <w:t xml:space="preserve">el de aula invertida </w:t>
+      </w:r>
+      <w:r>
+        <w:rPr>
+          <w:rFonts w:ascii="Times New Roman" w:eastAsia="Times New Roman" w:hAnsi="Times New Roman" w:cs="Times New Roman"/>
+          <w:sz w:val="24"/>
+          <w:szCs w:val="24"/>
+          <w:lang w:val="es-CO"/>
+        </w:rPr>
+        <w:t>(</w:t>
+      </w:r>
+      <w:proofErr w:type="spellStart"/>
+      <w:r>
+        <w:rPr>
+          <w:rFonts w:ascii="Times New Roman" w:eastAsia="Times New Roman" w:hAnsi="Times New Roman" w:cs="Times New Roman"/>
+          <w:sz w:val="24"/>
+          <w:szCs w:val="24"/>
+          <w:lang w:val="es-CO"/>
+        </w:rPr>
+        <w:t>flipped</w:t>
+      </w:r>
+      <w:proofErr w:type="spellEnd"/>
+      <w:r>
+        <w:rPr>
+          <w:rFonts w:ascii="Times New Roman" w:eastAsia="Times New Roman" w:hAnsi="Times New Roman" w:cs="Times New Roman"/>
+          <w:sz w:val="24"/>
+          <w:szCs w:val="24"/>
+          <w:lang w:val="es-CO"/>
+        </w:rPr>
+        <w:t xml:space="preserve"> </w:t>
+      </w:r>
+      <w:proofErr w:type="spellStart"/>
+      <w:r>
+        <w:rPr>
+          <w:rFonts w:ascii="Times New Roman" w:eastAsia="Times New Roman" w:hAnsi="Times New Roman" w:cs="Times New Roman"/>
+          <w:sz w:val="24"/>
+          <w:szCs w:val="24"/>
+          <w:lang w:val="es-CO"/>
+        </w:rPr>
+        <w:t>classroom</w:t>
+      </w:r>
+      <w:proofErr w:type="spellEnd"/>
+      <w:r>
+        <w:rPr>
+          <w:rFonts w:ascii="Times New Roman" w:eastAsia="Times New Roman" w:hAnsi="Times New Roman" w:cs="Times New Roman"/>
+          <w:sz w:val="24"/>
+          <w:szCs w:val="24"/>
+          <w:lang w:val="es-CO"/>
+        </w:rPr>
+        <w:t xml:space="preserve">), </w:t>
+      </w:r>
+      <w:r>
+        <w:rPr>
+          <w:rFonts w:ascii="Times New Roman" w:eastAsia="Times New Roman" w:hAnsi="Times New Roman" w:cs="Times New Roman"/>
+          <w:sz w:val="24"/>
+          <w:szCs w:val="24"/>
+          <w:lang w:val="es-CO"/>
+        </w:rPr>
+        <w:t xml:space="preserve">en el que los contenidos y procedimientos los puede leer y adquirir </w:t>
       </w:r>
       <w:r>
         <w:rPr>
@@ -1859,57 +2319,25 @@
           <w:szCs w:val="24"/>
           <w:lang w:val="es-CO"/>
         </w:rPr>
-        <w:t xml:space="preserve"> que permite sacar copias de ellos </w:t>
-      </w:r>
-      <w:proofErr w:type="spellStart"/>
-      <w:r>
-        <w:rPr>
-          <w:rFonts w:ascii="Times New Roman" w:eastAsia="Times New Roman" w:hAnsi="Times New Roman" w:cs="Times New Roman"/>
-          <w:sz w:val="24"/>
-          <w:szCs w:val="24"/>
-          <w:lang w:val="es-CO"/>
-        </w:rPr>
-        <w:t>y</w:t>
-      </w:r>
-      <w:proofErr w:type="spellEnd"/>
-      <w:r>
-        <w:rPr>
-          <w:rFonts w:ascii="Times New Roman" w:eastAsia="Times New Roman" w:hAnsi="Times New Roman" w:cs="Times New Roman"/>
-          <w:sz w:val="24"/>
-          <w:szCs w:val="24"/>
-          <w:lang w:val="es-CO"/>
-        </w:rPr>
-        <w:t xml:space="preserve"> leerlos de manera interactiva </w:t>
-      </w:r>
-      <w:proofErr w:type="spellStart"/>
-      <w:r>
-        <w:rPr>
-          <w:rFonts w:ascii="Times New Roman" w:eastAsia="Times New Roman" w:hAnsi="Times New Roman" w:cs="Times New Roman"/>
-          <w:sz w:val="24"/>
-          <w:szCs w:val="24"/>
-          <w:lang w:val="es-CO"/>
-        </w:rPr>
-        <w:t>y</w:t>
-      </w:r>
-      <w:proofErr w:type="spellEnd"/>
-      <w:r>
-        <w:rPr>
-          <w:rFonts w:ascii="Times New Roman" w:eastAsia="Times New Roman" w:hAnsi="Times New Roman" w:cs="Times New Roman"/>
-          <w:sz w:val="24"/>
-          <w:szCs w:val="24"/>
-          <w:lang w:val="es-CO"/>
-        </w:rPr>
-        <w:t xml:space="preserve"> experimental a través de </w:t>
-      </w:r>
-      <w:r>
-        <w:rPr>
-          <w:rFonts w:ascii="Times New Roman" w:eastAsia="Times New Roman" w:hAnsi="Times New Roman" w:cs="Times New Roman"/>
-          <w:sz w:val="24"/>
-          <w:szCs w:val="24"/>
-          <w:lang w:val="es-CO"/>
-        </w:rPr>
-        <w:lastRenderedPageBreak/>
-        <w:t xml:space="preserve">la aplicación en Línea Google </w:t>
+        <w:t xml:space="preserve"> que permite sacar copias de ellos y leerlos de manera interactiva y experimental a través de la aplicación en Línea </w:t>
+      </w:r>
+      <w:r>
+        <w:rPr>
+          <w:rFonts w:ascii="Times New Roman" w:eastAsia="Times New Roman" w:hAnsi="Times New Roman" w:cs="Times New Roman"/>
+          <w:sz w:val="24"/>
+          <w:szCs w:val="24"/>
+          <w:lang w:val="es-CO"/>
+        </w:rPr>
+        <w:t xml:space="preserve">llamada </w:t>
+      </w:r>
+      <w:r>
+        <w:rPr>
+          <w:rFonts w:ascii="Times New Roman" w:eastAsia="Times New Roman" w:hAnsi="Times New Roman" w:cs="Times New Roman"/>
+          <w:sz w:val="24"/>
+          <w:szCs w:val="24"/>
+          <w:lang w:val="es-CO"/>
+        </w:rPr>
+        <w:t xml:space="preserve">Google </w:t>
       </w:r>
       <w:proofErr w:type="spellStart"/>
       <w:r>
@@ -2353,11 +2781,22 @@
       <w:r>
         <w:rPr>
           <w:rFonts w:ascii="Times New Roman" w:eastAsia="Times New Roman" w:hAnsi="Times New Roman" w:cs="Times New Roman"/>
-          <w:sz w:val="24"/>
-          <w:szCs w:val="24"/>
-          <w:lang w:val="es-CO"/>
-        </w:rPr>
-        <w:t>Demanda esperada (Se priorizarán las ofertas que aporten elementos que soporten la demanda del programa en el medio).</w:t>
+          <w:b/>
+          <w:bCs/>
+          <w:sz w:val="24"/>
+          <w:szCs w:val="24"/>
+          <w:lang w:val="es-CO"/>
+        </w:rPr>
+        <w:t>Demanda esperada</w:t>
+      </w:r>
+      <w:r>
+        <w:rPr>
+          <w:rFonts w:ascii="Times New Roman" w:eastAsia="Times New Roman" w:hAnsi="Times New Roman" w:cs="Times New Roman"/>
+          <w:sz w:val="24"/>
+          <w:szCs w:val="24"/>
+          <w:lang w:val="es-CO"/>
+        </w:rPr>
+        <w:t xml:space="preserve"> (Se priorizarán las ofertas que aporten elementos que soporten la demanda del programa en el medio).</w:t>
       </w:r>
     </w:p>
     <w:p>
@@ -2499,14 +2938,18 @@
         <w:spacing w:before="100" w:beforeAutospacing="1" w:after="100" w:afterAutospacing="1" w:line="240" w:lineRule="auto"/>
         <w:rPr>
           <w:rFonts w:ascii="Times New Roman" w:eastAsia="Times New Roman" w:hAnsi="Times New Roman" w:cs="Times New Roman"/>
-          <w:sz w:val="24"/>
-          <w:szCs w:val="24"/>
-          <w:lang w:val="es-CO"/>
-        </w:rPr>
-      </w:pPr>
-      <w:r>
-        <w:rPr>
-          <w:rFonts w:ascii="Times New Roman" w:eastAsia="Times New Roman" w:hAnsi="Times New Roman" w:cs="Times New Roman"/>
+          <w:b/>
+          <w:bCs/>
+          <w:sz w:val="24"/>
+          <w:szCs w:val="24"/>
+          <w:lang w:val="es-CO"/>
+        </w:rPr>
+      </w:pPr>
+      <w:r>
+        <w:rPr>
+          <w:rFonts w:ascii="Times New Roman" w:eastAsia="Times New Roman" w:hAnsi="Times New Roman" w:cs="Times New Roman"/>
+          <w:b/>
+          <w:bCs/>
           <w:sz w:val="24"/>
           <w:szCs w:val="24"/>
           <w:lang w:val="es-CO"/>
@@ -2531,6 +2974,7 @@
           <w:szCs w:val="24"/>
           <w:lang w:val="es-CO"/>
         </w:rPr>
+        <w:lastRenderedPageBreak/>
         <w:t xml:space="preserve">El profesor Marco Julio Cañas ha sido Profesor del área de machine </w:t>
       </w:r>
       <w:proofErr w:type="spellStart"/>
@@ -2649,7 +3093,25 @@
           <w:szCs w:val="24"/>
           <w:lang w:val="es-CO"/>
         </w:rPr>
-        <w:t xml:space="preserve"> es bibliotecóloga experta en consulta en bases de datos académicas. </w:t>
+        <w:t xml:space="preserve"> es bibliotecóloga experta en consulta en bases de datos académicas</w:t>
+      </w:r>
+      <w:r>
+        <w:rPr>
+          <w:rFonts w:ascii="Times New Roman" w:eastAsia="Times New Roman" w:hAnsi="Times New Roman" w:cs="Times New Roman"/>
+          <w:sz w:val="24"/>
+          <w:szCs w:val="24"/>
+          <w:lang w:val="es-CO"/>
+        </w:rPr>
+        <w:t xml:space="preserve"> para el Sistema de Bibliotecas de nuestra Universidad</w:t>
+      </w:r>
+      <w:r>
+        <w:rPr>
+          <w:rFonts w:ascii="Times New Roman" w:eastAsia="Times New Roman" w:hAnsi="Times New Roman" w:cs="Times New Roman"/>
+          <w:sz w:val="24"/>
+          <w:szCs w:val="24"/>
+          <w:lang w:val="es-CO"/>
+        </w:rPr>
+        <w:t xml:space="preserve">. </w:t>
       </w:r>
       <w:r>
         <w:rPr>
@@ -2959,7 +3421,6 @@
         <w:rPr>
           <w:lang w:val="es-CO"/>
         </w:rPr>
-        <w:lastRenderedPageBreak/>
         <w:t>Referentes</w:t>
       </w:r>
     </w:p>
@@ -3434,6 +3895,119 @@
       </w:rPr>
     </w:lvl>
   </w:abstractNum>
+  <w:abstractNum w:abstractNumId="4" w15:restartNumberingAfterBreak="0">
+    <w:nsid w:val="5FA74AF4"/>
+    <w:multiLevelType w:val="hybridMultilevel"/>
+    <w:tmpl w:val="4D2C199A"/>
+    <w:lvl w:ilvl="0" w:tplc="240A0001">
+      <w:start w:val="1"/>
+      <w:numFmt w:val="bullet"/>
+      <w:lvlText w:val=""/>
+      <w:lvlJc w:val="left"/>
+      <w:pPr>
+        <w:ind w:left="1680" w:hanging="360"/>
+      </w:pPr>
+      <w:rPr>
+        <w:rFonts w:ascii="Symbol" w:hAnsi="Symbol" w:hint="default"/>
+      </w:rPr>
+    </w:lvl>
+    <w:lvl w:ilvl="1" w:tplc="04090003" w:tentative="1">
+      <w:start w:val="1"/>
+      <w:numFmt w:val="bullet"/>
+      <w:lvlText w:val="o"/>
+      <w:lvlJc w:val="left"/>
+      <w:pPr>
+        <w:ind w:left="2400" w:hanging="360"/>
+      </w:pPr>
+      <w:rPr>
+        <w:rFonts w:ascii="Courier New" w:hAnsi="Courier New" w:cs="Courier New" w:hint="default"/>
+      </w:rPr>
+    </w:lvl>
+    <w:lvl w:ilvl="2" w:tplc="04090005" w:tentative="1">
+      <w:start w:val="1"/>
+      <w:numFmt w:val="bullet"/>
+      <w:lvlText w:val=""/>
+      <w:lvlJc w:val="left"/>
+      <w:pPr>
+        <w:ind w:left="3120" w:hanging="360"/>
+      </w:pPr>
+      <w:rPr>
+        <w:rFonts w:ascii="Wingdings" w:hAnsi="Wingdings" w:hint="default"/>
+      </w:rPr>
+    </w:lvl>
+    <w:lvl w:ilvl="3" w:tplc="04090001" w:tentative="1">
+      <w:start w:val="1"/>
+      <w:numFmt w:val="bullet"/>
+      <w:lvlText w:val=""/>
+      <w:lvlJc w:val="left"/>
+      <w:pPr>
+        <w:ind w:left="3840" w:hanging="360"/>
+      </w:pPr>
+      <w:rPr>
+        <w:rFonts w:ascii="Symbol" w:hAnsi="Symbol" w:hint="default"/>
+      </w:rPr>
+    </w:lvl>
+    <w:lvl w:ilvl="4" w:tplc="04090003" w:tentative="1">
+      <w:start w:val="1"/>
+      <w:numFmt w:val="bullet"/>
+      <w:lvlText w:val="o"/>
+      <w:lvlJc w:val="left"/>
+      <w:pPr>
+        <w:ind w:left="4560" w:hanging="360"/>
+      </w:pPr>
+      <w:rPr>
+        <w:rFonts w:ascii="Courier New" w:hAnsi="Courier New" w:cs="Courier New" w:hint="default"/>
+      </w:rPr>
+    </w:lvl>
+    <w:lvl w:ilvl="5" w:tplc="04090005" w:tentative="1">
+      <w:start w:val="1"/>
+      <w:numFmt w:val="bullet"/>
+      <w:lvlText w:val=""/>
+      <w:lvlJc w:val="left"/>
+      <w:pPr>
+        <w:ind w:left="5280" w:hanging="360"/>
+      </w:pPr>
+      <w:rPr>
+        <w:rFonts w:ascii="Wingdings" w:hAnsi="Wingdings" w:hint="default"/>
+      </w:rPr>
+    </w:lvl>
+    <w:lvl w:ilvl="6" w:tplc="04090001" w:tentative="1">
+      <w:start w:val="1"/>
+      <w:numFmt w:val="bullet"/>
+      <w:lvlText w:val=""/>
+      <w:lvlJc w:val="left"/>
+      <w:pPr>
+        <w:ind w:left="6000" w:hanging="360"/>
+      </w:pPr>
+      <w:rPr>
+        <w:rFonts w:ascii="Symbol" w:hAnsi="Symbol" w:hint="default"/>
+      </w:rPr>
+    </w:lvl>
+    <w:lvl w:ilvl="7" w:tplc="04090003" w:tentative="1">
+      <w:start w:val="1"/>
+      <w:numFmt w:val="bullet"/>
+      <w:lvlText w:val="o"/>
+      <w:lvlJc w:val="left"/>
+      <w:pPr>
+        <w:ind w:left="6720" w:hanging="360"/>
+      </w:pPr>
+      <w:rPr>
+        <w:rFonts w:ascii="Courier New" w:hAnsi="Courier New" w:cs="Courier New" w:hint="default"/>
+      </w:rPr>
+    </w:lvl>
+    <w:lvl w:ilvl="8" w:tplc="04090005" w:tentative="1">
+      <w:start w:val="1"/>
+      <w:numFmt w:val="bullet"/>
+      <w:lvlText w:val=""/>
+      <w:lvlJc w:val="left"/>
+      <w:pPr>
+        <w:ind w:left="7440" w:hanging="360"/>
+      </w:pPr>
+      <w:rPr>
+        <w:rFonts w:ascii="Wingdings" w:hAnsi="Wingdings" w:hint="default"/>
+      </w:rPr>
+    </w:lvl>
+  </w:abstractNum>
   <w:num w:numId="1" w16cid:durableId="1786970595">
     <w:abstractNumId w:val="3"/>
   </w:num>
@@ -3445,6 +4019,9 @@
   </w:num>
   <w:num w:numId="4" w16cid:durableId="1537507080">
     <w:abstractNumId w:val="0"/>
+  </w:num>
+  <w:num w:numId="5" w16cid:durableId="1340935754">
+    <w:abstractNumId w:val="4"/>
   </w:num>
 </w:numbering>
 </file>

</xml_diff>